<commit_message>
chore: actualizar y agregar plantillas Word/Excel de tramites
16 .docx actualizados y 8 archivos nuevos (incl. formato EO). La copia suelta REINGRESO - copia.docx se archiva en backups/ sin versionar; update_categorias_horas.py y catalogo se mueven a scripts_historicos/.
</commit_message>
<xml_diff>
--- a/gestion_escolar/templates/tramites/Plantillas/Word/ALTAINICIAL.docx
+++ b/gestion_escolar/templates/tramites/Plantillas/Word/ALTAINICIAL.docx
@@ -581,7 +581,6 @@
               </w:rPr>
               <w:t>{{</w:t>
             </w:r>
-            <w:proofErr w:type="spellStart"/>
             <w:r>
               <w:rPr>
                 <w:rFonts w:ascii="Arial" w:hAnsi="Arial" w:cs="Arial"/>
@@ -591,7 +590,6 @@
               </w:rPr>
               <w:t>Nombre_Titular</w:t>
             </w:r>
-            <w:proofErr w:type="spellEnd"/>
             <w:r>
               <w:rPr>
                 <w:rFonts w:ascii="Arial" w:hAnsi="Arial" w:cs="Arial"/>
@@ -664,7 +662,6 @@
               </w:rPr>
               <w:t>{{</w:t>
             </w:r>
-            <w:proofErr w:type="spellStart"/>
             <w:r>
               <w:rPr>
                 <w:rFonts w:ascii="Arial" w:hAnsi="Arial" w:cs="Arial"/>
@@ -673,7 +670,6 @@
               </w:rPr>
               <w:t>CURP_Titular</w:t>
             </w:r>
-            <w:proofErr w:type="spellEnd"/>
             <w:r>
               <w:rPr>
                 <w:rFonts w:ascii="Arial" w:hAnsi="Arial" w:cs="Arial"/>
@@ -742,7 +738,6 @@
               </w:rPr>
               <w:t>{{</w:t>
             </w:r>
-            <w:proofErr w:type="spellStart"/>
             <w:r>
               <w:rPr>
                 <w:rFonts w:ascii="Arial" w:hAnsi="Arial" w:cs="Arial"/>
@@ -751,7 +746,6 @@
               </w:rPr>
               <w:t>RFC_Titular</w:t>
             </w:r>
-            <w:proofErr w:type="spellEnd"/>
             <w:r>
               <w:rPr>
                 <w:rFonts w:ascii="Arial" w:hAnsi="Arial" w:cs="Arial"/>
@@ -881,6 +875,14 @@
               </w:rPr>
               <w:t xml:space="preserve"> </w:t>
             </w:r>
+            <w:r>
+              <w:rPr>
+                <w:rFonts w:ascii="Arial" w:hAnsi="Arial" w:cs="Arial"/>
+                <w:sz w:val="16"/>
+                <w:szCs w:val="16"/>
+              </w:rPr>
+              <w:t>{{Horas_Categoria}}</w:t>
+            </w:r>
           </w:p>
         </w:tc>
       </w:tr>
@@ -907,6 +909,7 @@
                 <w:szCs w:val="16"/>
               </w:rPr>
             </w:pPr>
+            <w:bookmarkStart w:id="0" w:name="_GoBack" w:colFirst="2" w:colLast="3"/>
             <w:r>
               <w:rPr>
                 <w:rFonts w:ascii="Arial" w:hAnsi="Arial" w:cs="Arial"/>
@@ -945,7 +948,6 @@
               </w:rPr>
               <w:t>{{</w:t>
             </w:r>
-            <w:proofErr w:type="spellStart"/>
             <w:r>
               <w:rPr>
                 <w:rFonts w:ascii="Arial" w:hAnsi="Arial" w:cs="Arial"/>
@@ -954,7 +956,6 @@
               </w:rPr>
               <w:t>Categoria_Titular</w:t>
             </w:r>
-            <w:proofErr w:type="spellEnd"/>
             <w:r>
               <w:rPr>
                 <w:rFonts w:ascii="Arial" w:hAnsi="Arial" w:cs="Arial"/>
@@ -987,7 +988,7 @@
                 <w:sz w:val="16"/>
                 <w:szCs w:val="16"/>
               </w:rPr>
-              <w:t>Asignatura:</w:t>
+              <w:t>Función:</w:t>
             </w:r>
           </w:p>
         </w:tc>
@@ -1018,7 +1019,98 @@
                 <w:sz w:val="16"/>
                 <w:szCs w:val="16"/>
               </w:rPr>
-              <w:t xml:space="preserve"> </w:t>
+              <w:t>{{Funcion_Titular</w:t>
+            </w:r>
+            <w:r>
+              <w:rPr>
+                <w:rFonts w:ascii="Arial" w:hAnsi="Arial" w:cs="Arial"/>
+                <w:sz w:val="16"/>
+                <w:szCs w:val="16"/>
+              </w:rPr>
+              <w:t>}}</w:t>
+            </w:r>
+          </w:p>
+        </w:tc>
+      </w:tr>
+      <w:bookmarkEnd w:id="0"/>
+      <w:tr>
+        <w:trPr>
+          <w:trHeight w:val="256"/>
+        </w:trPr>
+        <w:tc>
+          <w:tcPr>
+            <w:tcW w:w="1857" w:type="dxa"/>
+            <w:gridSpan w:val="8"/>
+            <w:tcBorders>
+              <w:left w:val="single" w:sz="18" w:space="0" w:color="auto"/>
+              <w:bottom w:val="nil"/>
+            </w:tcBorders>
+            <w:shd w:val="clear" w:color="auto" w:fill="auto"/>
+            <w:noWrap/>
+            <w:vAlign w:val="bottom"/>
+          </w:tcPr>
+          <w:p>
+            <w:pPr>
+              <w:rPr>
+                <w:rFonts w:ascii="Arial" w:hAnsi="Arial" w:cs="Arial"/>
+                <w:sz w:val="16"/>
+                <w:szCs w:val="16"/>
+              </w:rPr>
+            </w:pPr>
+            <w:r>
+              <w:rPr>
+                <w:rFonts w:ascii="Arial" w:hAnsi="Arial" w:cs="Arial"/>
+                <w:sz w:val="16"/>
+                <w:szCs w:val="16"/>
+              </w:rPr>
+              <w:t>Clave (s) presupuestal:</w:t>
+            </w:r>
+          </w:p>
+        </w:tc>
+        <w:tc>
+          <w:tcPr>
+            <w:tcW w:w="7304" w:type="dxa"/>
+            <w:gridSpan w:val="27"/>
+            <w:tcBorders>
+              <w:top w:val="nil"/>
+              <w:bottom w:val="single" w:sz="8" w:space="0" w:color="auto"/>
+              <w:right w:val="single" w:sz="18" w:space="0" w:color="auto"/>
+            </w:tcBorders>
+            <w:shd w:val="clear" w:color="auto" w:fill="auto"/>
+            <w:noWrap/>
+            <w:vAlign w:val="bottom"/>
+          </w:tcPr>
+          <w:p>
+            <w:pPr>
+              <w:rPr>
+                <w:rFonts w:ascii="Arial" w:hAnsi="Arial" w:cs="Arial"/>
+                <w:sz w:val="16"/>
+                <w:szCs w:val="16"/>
+              </w:rPr>
+            </w:pPr>
+            <w:r>
+              <w:rPr>
+                <w:rFonts w:ascii="Arial" w:hAnsi="Arial" w:cs="Arial"/>
+                <w:sz w:val="16"/>
+                <w:szCs w:val="16"/>
+              </w:rPr>
+              <w:t>{{</w:t>
+            </w:r>
+            <w:r>
+              <w:rPr>
+                <w:rFonts w:ascii="Arial" w:hAnsi="Arial" w:cs="Arial"/>
+                <w:sz w:val="16"/>
+                <w:szCs w:val="16"/>
+              </w:rPr>
+              <w:t>Presupuestal_Titular</w:t>
+            </w:r>
+            <w:r>
+              <w:rPr>
+                <w:rFonts w:ascii="Arial" w:hAnsi="Arial" w:cs="Arial"/>
+                <w:sz w:val="16"/>
+                <w:szCs w:val="16"/>
+              </w:rPr>
+              <w:t>}}</w:t>
             </w:r>
           </w:p>
         </w:tc>
@@ -1029,40 +1121,11 @@
         </w:trPr>
         <w:tc>
           <w:tcPr>
-            <w:tcW w:w="1857" w:type="dxa"/>
-            <w:gridSpan w:val="8"/>
-            <w:tcBorders>
+            <w:tcW w:w="9161" w:type="dxa"/>
+            <w:gridSpan w:val="35"/>
+            <w:tcBorders>
+              <w:top w:val="nil"/>
               <w:left w:val="single" w:sz="18" w:space="0" w:color="auto"/>
-              <w:bottom w:val="nil"/>
-            </w:tcBorders>
-            <w:shd w:val="clear" w:color="auto" w:fill="auto"/>
-            <w:noWrap/>
-            <w:vAlign w:val="bottom"/>
-          </w:tcPr>
-          <w:p>
-            <w:pPr>
-              <w:rPr>
-                <w:rFonts w:ascii="Arial" w:hAnsi="Arial" w:cs="Arial"/>
-                <w:sz w:val="16"/>
-                <w:szCs w:val="16"/>
-              </w:rPr>
-            </w:pPr>
-            <w:r>
-              <w:rPr>
-                <w:rFonts w:ascii="Arial" w:hAnsi="Arial" w:cs="Arial"/>
-                <w:sz w:val="16"/>
-                <w:szCs w:val="16"/>
-              </w:rPr>
-              <w:t>Clave (s) presupuestal:</w:t>
-            </w:r>
-          </w:p>
-        </w:tc>
-        <w:tc>
-          <w:tcPr>
-            <w:tcW w:w="7304" w:type="dxa"/>
-            <w:gridSpan w:val="27"/>
-            <w:tcBorders>
-              <w:top w:val="nil"/>
               <w:bottom w:val="single" w:sz="8" w:space="0" w:color="auto"/>
               <w:right w:val="single" w:sz="18" w:space="0" w:color="auto"/>
             </w:tcBorders>
@@ -1084,25 +1147,15 @@
                 <w:sz w:val="16"/>
                 <w:szCs w:val="16"/>
               </w:rPr>
-              <w:t>{{</w:t>
-            </w:r>
-            <w:proofErr w:type="spellStart"/>
-            <w:r>
-              <w:rPr>
-                <w:rFonts w:ascii="Arial" w:hAnsi="Arial" w:cs="Arial"/>
-                <w:sz w:val="16"/>
-                <w:szCs w:val="16"/>
-              </w:rPr>
-              <w:t>Presupuestal_Titular</w:t>
-            </w:r>
-            <w:proofErr w:type="spellEnd"/>
-            <w:r>
-              <w:rPr>
-                <w:rFonts w:ascii="Arial" w:hAnsi="Arial" w:cs="Arial"/>
-                <w:sz w:val="16"/>
-                <w:szCs w:val="16"/>
-              </w:rPr>
-              <w:t>}}</w:t>
+              <w:t> </w:t>
+            </w:r>
+            <w:r>
+              <w:rPr>
+                <w:rFonts w:ascii="Arial" w:hAnsi="Arial" w:cs="Arial"/>
+                <w:sz w:val="16"/>
+                <w:szCs w:val="16"/>
+              </w:rPr>
+              <w:t xml:space="preserve"> </w:t>
             </w:r>
           </w:p>
         </w:tc>
@@ -1113,11 +1166,190 @@
         </w:trPr>
         <w:tc>
           <w:tcPr>
-            <w:tcW w:w="9161" w:type="dxa"/>
-            <w:gridSpan w:val="35"/>
-            <w:tcBorders>
-              <w:top w:val="nil"/>
+            <w:tcW w:w="1498" w:type="dxa"/>
+            <w:gridSpan w:val="5"/>
+            <w:tcBorders>
+              <w:top w:val="single" w:sz="8" w:space="0" w:color="auto"/>
               <w:left w:val="single" w:sz="18" w:space="0" w:color="auto"/>
+            </w:tcBorders>
+            <w:shd w:val="clear" w:color="auto" w:fill="auto"/>
+            <w:noWrap/>
+            <w:vAlign w:val="bottom"/>
+          </w:tcPr>
+          <w:p>
+            <w:pPr>
+              <w:rPr>
+                <w:rFonts w:ascii="Arial" w:hAnsi="Arial" w:cs="Arial"/>
+                <w:sz w:val="16"/>
+                <w:szCs w:val="16"/>
+              </w:rPr>
+            </w:pPr>
+            <w:r>
+              <w:rPr>
+                <w:rFonts w:ascii="Arial" w:hAnsi="Arial" w:cs="Arial"/>
+                <w:sz w:val="16"/>
+                <w:szCs w:val="16"/>
+              </w:rPr>
+              <w:t>Nombre del CT:</w:t>
+            </w:r>
+          </w:p>
+        </w:tc>
+        <w:tc>
+          <w:tcPr>
+            <w:tcW w:w="2983" w:type="dxa"/>
+            <w:gridSpan w:val="13"/>
+            <w:tcBorders>
+              <w:top w:val="single" w:sz="8" w:space="0" w:color="auto"/>
+              <w:bottom w:val="single" w:sz="8" w:space="0" w:color="auto"/>
+            </w:tcBorders>
+            <w:shd w:val="clear" w:color="auto" w:fill="auto"/>
+            <w:noWrap/>
+            <w:vAlign w:val="bottom"/>
+          </w:tcPr>
+          <w:p>
+            <w:pPr>
+              <w:rPr>
+                <w:rFonts w:ascii="Arial" w:hAnsi="Arial" w:cs="Arial"/>
+                <w:sz w:val="16"/>
+                <w:szCs w:val="16"/>
+              </w:rPr>
+            </w:pPr>
+            <w:r>
+              <w:rPr>
+                <w:rFonts w:ascii="Arial" w:hAnsi="Arial" w:cs="Arial"/>
+                <w:sz w:val="16"/>
+                <w:szCs w:val="16"/>
+              </w:rPr>
+              <w:t>{{</w:t>
+            </w:r>
+            <w:r>
+              <w:rPr>
+                <w:rFonts w:ascii="Arial" w:hAnsi="Arial" w:cs="Arial"/>
+                <w:sz w:val="16"/>
+                <w:szCs w:val="16"/>
+              </w:rPr>
+              <w:t>Nombre_CT</w:t>
+            </w:r>
+            <w:r>
+              <w:rPr>
+                <w:rFonts w:ascii="Arial" w:hAnsi="Arial" w:cs="Arial"/>
+                <w:sz w:val="16"/>
+                <w:szCs w:val="16"/>
+              </w:rPr>
+              <w:t>}}</w:t>
+            </w:r>
+          </w:p>
+        </w:tc>
+        <w:tc>
+          <w:tcPr>
+            <w:tcW w:w="720" w:type="dxa"/>
+            <w:gridSpan w:val="6"/>
+            <w:tcBorders>
+              <w:top w:val="single" w:sz="8" w:space="0" w:color="auto"/>
+            </w:tcBorders>
+            <w:shd w:val="clear" w:color="auto" w:fill="auto"/>
+            <w:noWrap/>
+            <w:vAlign w:val="bottom"/>
+          </w:tcPr>
+          <w:p>
+            <w:pPr>
+              <w:rPr>
+                <w:rFonts w:ascii="Arial" w:hAnsi="Arial" w:cs="Arial"/>
+                <w:sz w:val="16"/>
+                <w:szCs w:val="16"/>
+              </w:rPr>
+            </w:pPr>
+            <w:r>
+              <w:rPr>
+                <w:rFonts w:ascii="Arial" w:hAnsi="Arial" w:cs="Arial"/>
+                <w:sz w:val="16"/>
+                <w:szCs w:val="16"/>
+              </w:rPr>
+              <w:t xml:space="preserve">  Turno:</w:t>
+            </w:r>
+          </w:p>
+        </w:tc>
+        <w:tc>
+          <w:tcPr>
+            <w:tcW w:w="1440" w:type="dxa"/>
+            <w:gridSpan w:val="7"/>
+            <w:tcBorders>
+              <w:top w:val="single" w:sz="8" w:space="0" w:color="auto"/>
+              <w:bottom w:val="single" w:sz="8" w:space="0" w:color="auto"/>
+            </w:tcBorders>
+            <w:shd w:val="clear" w:color="auto" w:fill="auto"/>
+            <w:noWrap/>
+            <w:vAlign w:val="bottom"/>
+          </w:tcPr>
+          <w:p>
+            <w:pPr>
+              <w:rPr>
+                <w:rFonts w:ascii="Arial" w:hAnsi="Arial" w:cs="Arial"/>
+                <w:sz w:val="16"/>
+                <w:szCs w:val="16"/>
+              </w:rPr>
+            </w:pPr>
+            <w:r>
+              <w:rPr>
+                <w:rFonts w:ascii="Arial" w:hAnsi="Arial" w:cs="Arial"/>
+                <w:sz w:val="16"/>
+                <w:szCs w:val="16"/>
+              </w:rPr>
+              <w:t>{{</w:t>
+            </w:r>
+            <w:r>
+              <w:rPr>
+                <w:rFonts w:ascii="Arial" w:hAnsi="Arial" w:cs="Arial"/>
+                <w:sz w:val="16"/>
+                <w:szCs w:val="16"/>
+              </w:rPr>
+              <w:t>Turno</w:t>
+            </w:r>
+            <w:r>
+              <w:rPr>
+                <w:rFonts w:ascii="Arial" w:hAnsi="Arial" w:cs="Arial"/>
+                <w:sz w:val="16"/>
+                <w:szCs w:val="16"/>
+              </w:rPr>
+              <w:t>}}</w:t>
+            </w:r>
+          </w:p>
+        </w:tc>
+        <w:tc>
+          <w:tcPr>
+            <w:tcW w:w="720" w:type="dxa"/>
+            <w:gridSpan w:val="2"/>
+            <w:tcBorders>
+              <w:top w:val="single" w:sz="8" w:space="0" w:color="auto"/>
+            </w:tcBorders>
+            <w:shd w:val="clear" w:color="auto" w:fill="auto"/>
+            <w:noWrap/>
+            <w:vAlign w:val="bottom"/>
+          </w:tcPr>
+          <w:p>
+            <w:pPr>
+              <w:rPr>
+                <w:rFonts w:ascii="Arial" w:hAnsi="Arial" w:cs="Arial"/>
+                <w:sz w:val="16"/>
+                <w:szCs w:val="16"/>
+              </w:rPr>
+            </w:pPr>
+            <w:r>
+              <w:rPr>
+                <w:rFonts w:ascii="Arial" w:hAnsi="Arial" w:cs="Arial"/>
+                <w:sz w:val="16"/>
+                <w:szCs w:val="16"/>
+              </w:rPr>
+              <w:t>Horario:</w:t>
+            </w:r>
+          </w:p>
+        </w:tc>
+        <w:tc>
+          <w:tcPr>
+            <w:tcW w:w="1800" w:type="dxa"/>
+            <w:gridSpan w:val="2"/>
+            <w:tcBorders>
+              <w:top w:val="single" w:sz="8" w:space="0" w:color="auto"/>
               <w:bottom w:val="single" w:sz="8" w:space="0" w:color="auto"/>
               <w:right w:val="single" w:sz="18" w:space="0" w:color="auto"/>
             </w:tcBorders>
@@ -1141,6 +1373,160 @@
               </w:rPr>
               <w:t> </w:t>
             </w:r>
+          </w:p>
+        </w:tc>
+      </w:tr>
+      <w:tr>
+        <w:trPr>
+          <w:trHeight w:val="126"/>
+        </w:trPr>
+        <w:tc>
+          <w:tcPr>
+            <w:tcW w:w="1130" w:type="dxa"/>
+            <w:gridSpan w:val="3"/>
+            <w:tcBorders>
+              <w:left w:val="single" w:sz="18" w:space="0" w:color="auto"/>
+            </w:tcBorders>
+            <w:shd w:val="clear" w:color="auto" w:fill="auto"/>
+            <w:noWrap/>
+            <w:vAlign w:val="bottom"/>
+          </w:tcPr>
+          <w:p>
+            <w:pPr>
+              <w:rPr>
+                <w:rFonts w:ascii="Arial" w:hAnsi="Arial" w:cs="Arial"/>
+                <w:sz w:val="16"/>
+                <w:szCs w:val="16"/>
+              </w:rPr>
+            </w:pPr>
+            <w:r>
+              <w:rPr>
+                <w:rFonts w:ascii="Arial" w:hAnsi="Arial" w:cs="Arial"/>
+                <w:sz w:val="16"/>
+                <w:szCs w:val="16"/>
+              </w:rPr>
+              <w:t>Clave del CT:</w:t>
+            </w:r>
+          </w:p>
+        </w:tc>
+        <w:tc>
+          <w:tcPr>
+            <w:tcW w:w="1460" w:type="dxa"/>
+            <w:gridSpan w:val="9"/>
+            <w:tcBorders>
+              <w:top w:val="nil"/>
+              <w:bottom w:val="single" w:sz="8" w:space="0" w:color="auto"/>
+            </w:tcBorders>
+            <w:shd w:val="clear" w:color="auto" w:fill="auto"/>
+            <w:noWrap/>
+            <w:vAlign w:val="bottom"/>
+          </w:tcPr>
+          <w:p>
+            <w:pPr>
+              <w:rPr>
+                <w:rFonts w:ascii="Arial" w:hAnsi="Arial" w:cs="Arial"/>
+                <w:sz w:val="16"/>
+                <w:szCs w:val="16"/>
+              </w:rPr>
+            </w:pPr>
+            <w:bookmarkStart w:id="1" w:name="CLAVE_CT"/>
+            <w:r>
+              <w:rPr>
+                <w:rFonts w:ascii="Arial" w:hAnsi="Arial" w:cs="Arial"/>
+                <w:sz w:val="16"/>
+                <w:szCs w:val="16"/>
+              </w:rPr>
+              <w:t>{{</w:t>
+            </w:r>
+            <w:r>
+              <w:rPr>
+                <w:rFonts w:ascii="Arial" w:hAnsi="Arial" w:cs="Arial"/>
+                <w:sz w:val="16"/>
+                <w:szCs w:val="16"/>
+              </w:rPr>
+              <w:t>Clave_CT</w:t>
+            </w:r>
+            <w:r>
+              <w:rPr>
+                <w:rFonts w:ascii="Arial" w:hAnsi="Arial" w:cs="Arial"/>
+                <w:sz w:val="16"/>
+                <w:szCs w:val="16"/>
+              </w:rPr>
+              <w:t>}}</w:t>
+            </w:r>
+            <w:r>
+              <w:rPr>
+                <w:rFonts w:ascii="Arial" w:hAnsi="Arial" w:cs="Arial"/>
+                <w:sz w:val="16"/>
+                <w:szCs w:val="16"/>
+              </w:rPr>
+              <w:fldChar w:fldCharType="begin"/>
+            </w:r>
+            <w:r>
+              <w:rPr>
+                <w:rFonts w:ascii="Arial" w:hAnsi="Arial" w:cs="Arial"/>
+                <w:sz w:val="16"/>
+                <w:szCs w:val="16"/>
+              </w:rPr>
+              <w:instrText xml:space="preserve"> FILLIN  "CLAVE DEL CENTRO DE TRABAJO :"  \* MERGEFORMAT </w:instrText>
+            </w:r>
+            <w:r>
+              <w:rPr>
+                <w:rFonts w:ascii="Arial" w:hAnsi="Arial" w:cs="Arial"/>
+                <w:sz w:val="16"/>
+                <w:szCs w:val="16"/>
+              </w:rPr>
+              <w:fldChar w:fldCharType="end"/>
+            </w:r>
+            <w:bookmarkEnd w:id="1"/>
+          </w:p>
+        </w:tc>
+        <w:tc>
+          <w:tcPr>
+            <w:tcW w:w="1440" w:type="dxa"/>
+            <w:gridSpan w:val="5"/>
+            <w:shd w:val="clear" w:color="auto" w:fill="auto"/>
+            <w:noWrap/>
+            <w:vAlign w:val="bottom"/>
+          </w:tcPr>
+          <w:p>
+            <w:pPr>
+              <w:rPr>
+                <w:rFonts w:ascii="Arial" w:hAnsi="Arial" w:cs="Arial"/>
+                <w:sz w:val="16"/>
+                <w:szCs w:val="16"/>
+              </w:rPr>
+            </w:pPr>
+            <w:r>
+              <w:rPr>
+                <w:rFonts w:ascii="Arial" w:hAnsi="Arial" w:cs="Arial"/>
+                <w:sz w:val="16"/>
+                <w:szCs w:val="16"/>
+              </w:rPr>
+              <w:t>Zona económica:</w:t>
+            </w:r>
+          </w:p>
+        </w:tc>
+        <w:tc>
+          <w:tcPr>
+            <w:tcW w:w="900" w:type="dxa"/>
+            <w:gridSpan w:val="4"/>
+            <w:tcBorders>
+              <w:top w:val="nil"/>
+              <w:bottom w:val="single" w:sz="8" w:space="0" w:color="auto"/>
+            </w:tcBorders>
+            <w:shd w:val="clear" w:color="auto" w:fill="auto"/>
+            <w:noWrap/>
+            <w:vAlign w:val="bottom"/>
+          </w:tcPr>
+          <w:p>
+            <w:pPr>
+              <w:rPr>
+                <w:rFonts w:ascii="Arial" w:hAnsi="Arial" w:cs="Arial"/>
+                <w:sz w:val="16"/>
+                <w:szCs w:val="16"/>
+              </w:rPr>
+            </w:pPr>
             <w:r>
               <w:rPr>
                 <w:rFonts w:ascii="Arial" w:hAnsi="Arial" w:cs="Arial"/>
@@ -1148,6 +1534,168 @@
                 <w:szCs w:val="16"/>
               </w:rPr>
               <w:t xml:space="preserve"> </w:t>
+            </w:r>
+            <w:r>
+              <w:rPr>
+                <w:rFonts w:ascii="Arial" w:hAnsi="Arial" w:cs="Arial"/>
+                <w:sz w:val="16"/>
+                <w:szCs w:val="16"/>
+              </w:rPr>
+              <w:t>{{</w:t>
+            </w:r>
+            <w:r>
+              <w:rPr>
+                <w:rFonts w:ascii="Arial" w:hAnsi="Arial" w:cs="Arial"/>
+                <w:sz w:val="16"/>
+                <w:szCs w:val="16"/>
+              </w:rPr>
+              <w:t>Z_economica</w:t>
+            </w:r>
+            <w:r>
+              <w:rPr>
+                <w:rFonts w:ascii="Arial" w:hAnsi="Arial" w:cs="Arial"/>
+                <w:sz w:val="16"/>
+                <w:szCs w:val="16"/>
+              </w:rPr>
+              <w:t>}}</w:t>
+            </w:r>
+          </w:p>
+        </w:tc>
+        <w:tc>
+          <w:tcPr>
+            <w:tcW w:w="1260" w:type="dxa"/>
+            <w:gridSpan w:val="8"/>
+            <w:shd w:val="clear" w:color="auto" w:fill="auto"/>
+            <w:noWrap/>
+            <w:vAlign w:val="bottom"/>
+          </w:tcPr>
+          <w:p>
+            <w:pPr>
+              <w:rPr>
+                <w:rFonts w:ascii="Arial" w:hAnsi="Arial" w:cs="Arial"/>
+                <w:sz w:val="16"/>
+                <w:szCs w:val="16"/>
+              </w:rPr>
+            </w:pPr>
+            <w:r>
+              <w:rPr>
+                <w:rFonts w:ascii="Arial" w:hAnsi="Arial" w:cs="Arial"/>
+                <w:sz w:val="16"/>
+                <w:szCs w:val="16"/>
+              </w:rPr>
+              <w:t>Zona escolar:</w:t>
+            </w:r>
+          </w:p>
+        </w:tc>
+        <w:tc>
+          <w:tcPr>
+            <w:tcW w:w="1080" w:type="dxa"/>
+            <w:gridSpan w:val="3"/>
+            <w:tcBorders>
+              <w:top w:val="nil"/>
+              <w:bottom w:val="single" w:sz="8" w:space="0" w:color="auto"/>
+            </w:tcBorders>
+            <w:shd w:val="clear" w:color="auto" w:fill="auto"/>
+            <w:noWrap/>
+            <w:vAlign w:val="bottom"/>
+          </w:tcPr>
+          <w:p>
+            <w:pPr>
+              <w:rPr>
+                <w:rFonts w:ascii="Arial" w:hAnsi="Arial" w:cs="Arial"/>
+                <w:sz w:val="16"/>
+                <w:szCs w:val="16"/>
+              </w:rPr>
+            </w:pPr>
+            <w:bookmarkStart w:id="2" w:name="Z_ESC"/>
+            <w:r>
+              <w:rPr>
+                <w:rFonts w:ascii="Arial" w:hAnsi="Arial" w:cs="Arial"/>
+                <w:sz w:val="16"/>
+                <w:szCs w:val="16"/>
+              </w:rPr>
+              <w:t xml:space="preserve">  </w:t>
+            </w:r>
+            <w:bookmarkEnd w:id="2"/>
+            <w:r>
+              <w:rPr>
+                <w:rFonts w:ascii="Arial" w:hAnsi="Arial" w:cs="Arial"/>
+                <w:sz w:val="16"/>
+                <w:szCs w:val="16"/>
+              </w:rPr>
+              <w:t>{{</w:t>
+            </w:r>
+            <w:r>
+              <w:rPr>
+                <w:rFonts w:ascii="Arial" w:hAnsi="Arial" w:cs="Arial"/>
+                <w:sz w:val="16"/>
+                <w:szCs w:val="16"/>
+              </w:rPr>
+              <w:t>Z_Escolar</w:t>
+            </w:r>
+            <w:r>
+              <w:rPr>
+                <w:rFonts w:ascii="Arial" w:hAnsi="Arial" w:cs="Arial"/>
+                <w:sz w:val="16"/>
+                <w:szCs w:val="16"/>
+              </w:rPr>
+              <w:t>}}</w:t>
+            </w:r>
+          </w:p>
+        </w:tc>
+        <w:tc>
+          <w:tcPr>
+            <w:tcW w:w="720" w:type="dxa"/>
+            <w:gridSpan w:val="2"/>
+            <w:shd w:val="clear" w:color="auto" w:fill="auto"/>
+            <w:noWrap/>
+            <w:vAlign w:val="bottom"/>
+          </w:tcPr>
+          <w:p>
+            <w:pPr>
+              <w:rPr>
+                <w:rFonts w:ascii="Arial" w:hAnsi="Arial" w:cs="Arial"/>
+                <w:sz w:val="16"/>
+                <w:szCs w:val="16"/>
+              </w:rPr>
+            </w:pPr>
+            <w:r>
+              <w:rPr>
+                <w:rFonts w:ascii="Arial" w:hAnsi="Arial" w:cs="Arial"/>
+                <w:sz w:val="16"/>
+                <w:szCs w:val="16"/>
+              </w:rPr>
+              <w:t>Sector:</w:t>
+            </w:r>
+          </w:p>
+        </w:tc>
+        <w:tc>
+          <w:tcPr>
+            <w:tcW w:w="1171" w:type="dxa"/>
+            <w:tcBorders>
+              <w:top w:val="nil"/>
+              <w:bottom w:val="single" w:sz="8" w:space="0" w:color="auto"/>
+              <w:right w:val="single" w:sz="18" w:space="0" w:color="auto"/>
+            </w:tcBorders>
+            <w:shd w:val="clear" w:color="auto" w:fill="auto"/>
+            <w:noWrap/>
+            <w:vAlign w:val="bottom"/>
+          </w:tcPr>
+          <w:p>
+            <w:pPr>
+              <w:rPr>
+                <w:rFonts w:ascii="Arial" w:hAnsi="Arial" w:cs="Arial"/>
+                <w:sz w:val="16"/>
+                <w:szCs w:val="16"/>
+              </w:rPr>
+            </w:pPr>
+            <w:r>
+              <w:rPr>
+                <w:rFonts w:ascii="Arial" w:hAnsi="Arial" w:cs="Arial"/>
+                <w:sz w:val="20"/>
+                <w:szCs w:val="20"/>
+              </w:rPr>
+              <w:t> </w:t>
             </w:r>
           </w:p>
         </w:tc>
@@ -1158,10 +1706,9 @@
         </w:trPr>
         <w:tc>
           <w:tcPr>
-            <w:tcW w:w="1498" w:type="dxa"/>
-            <w:gridSpan w:val="5"/>
-            <w:tcBorders>
-              <w:top w:val="single" w:sz="8" w:space="0" w:color="auto"/>
+            <w:tcW w:w="967" w:type="dxa"/>
+            <w:gridSpan w:val="2"/>
+            <w:tcBorders>
               <w:left w:val="single" w:sz="18" w:space="0" w:color="auto"/>
             </w:tcBorders>
             <w:shd w:val="clear" w:color="auto" w:fill="auto"/>
@@ -1182,168 +1729,16 @@
                 <w:sz w:val="16"/>
                 <w:szCs w:val="16"/>
               </w:rPr>
-              <w:t>Nombre del CT:</w:t>
-            </w:r>
-          </w:p>
-        </w:tc>
-        <w:tc>
-          <w:tcPr>
-            <w:tcW w:w="2983" w:type="dxa"/>
-            <w:gridSpan w:val="13"/>
-            <w:tcBorders>
-              <w:top w:val="single" w:sz="8" w:space="0" w:color="auto"/>
-              <w:bottom w:val="single" w:sz="8" w:space="0" w:color="auto"/>
-            </w:tcBorders>
-            <w:shd w:val="clear" w:color="auto" w:fill="auto"/>
-            <w:noWrap/>
-            <w:vAlign w:val="bottom"/>
-          </w:tcPr>
-          <w:p>
-            <w:pPr>
-              <w:rPr>
-                <w:rFonts w:ascii="Arial" w:hAnsi="Arial" w:cs="Arial"/>
-                <w:sz w:val="16"/>
-                <w:szCs w:val="16"/>
-              </w:rPr>
-            </w:pPr>
-            <w:r>
-              <w:rPr>
-                <w:rFonts w:ascii="Arial" w:hAnsi="Arial" w:cs="Arial"/>
-                <w:sz w:val="16"/>
-                <w:szCs w:val="16"/>
-              </w:rPr>
-              <w:t>{{</w:t>
-            </w:r>
-            <w:proofErr w:type="spellStart"/>
-            <w:r>
-              <w:rPr>
-                <w:rFonts w:ascii="Arial" w:hAnsi="Arial" w:cs="Arial"/>
-                <w:sz w:val="16"/>
-                <w:szCs w:val="16"/>
-              </w:rPr>
-              <w:t>Nombre_CT</w:t>
-            </w:r>
-            <w:proofErr w:type="spellEnd"/>
-            <w:r>
-              <w:rPr>
-                <w:rFonts w:ascii="Arial" w:hAnsi="Arial" w:cs="Arial"/>
-                <w:sz w:val="16"/>
-                <w:szCs w:val="16"/>
-              </w:rPr>
-              <w:t>}}</w:t>
-            </w:r>
-          </w:p>
-        </w:tc>
-        <w:tc>
-          <w:tcPr>
-            <w:tcW w:w="720" w:type="dxa"/>
-            <w:gridSpan w:val="6"/>
-            <w:tcBorders>
-              <w:top w:val="single" w:sz="8" w:space="0" w:color="auto"/>
-            </w:tcBorders>
-            <w:shd w:val="clear" w:color="auto" w:fill="auto"/>
-            <w:noWrap/>
-            <w:vAlign w:val="bottom"/>
-          </w:tcPr>
-          <w:p>
-            <w:pPr>
-              <w:rPr>
-                <w:rFonts w:ascii="Arial" w:hAnsi="Arial" w:cs="Arial"/>
-                <w:sz w:val="16"/>
-                <w:szCs w:val="16"/>
-              </w:rPr>
-            </w:pPr>
-            <w:r>
-              <w:rPr>
-                <w:rFonts w:ascii="Arial" w:hAnsi="Arial" w:cs="Arial"/>
-                <w:sz w:val="16"/>
-                <w:szCs w:val="16"/>
-              </w:rPr>
-              <w:t xml:space="preserve">  Turno:</w:t>
-            </w:r>
-          </w:p>
-        </w:tc>
-        <w:tc>
-          <w:tcPr>
-            <w:tcW w:w="1440" w:type="dxa"/>
-            <w:gridSpan w:val="7"/>
-            <w:tcBorders>
-              <w:top w:val="single" w:sz="8" w:space="0" w:color="auto"/>
-              <w:bottom w:val="single" w:sz="8" w:space="0" w:color="auto"/>
-            </w:tcBorders>
-            <w:shd w:val="clear" w:color="auto" w:fill="auto"/>
-            <w:noWrap/>
-            <w:vAlign w:val="bottom"/>
-          </w:tcPr>
-          <w:p>
-            <w:pPr>
-              <w:rPr>
-                <w:rFonts w:ascii="Arial" w:hAnsi="Arial" w:cs="Arial"/>
-                <w:sz w:val="16"/>
-                <w:szCs w:val="16"/>
-              </w:rPr>
-            </w:pPr>
-            <w:r>
-              <w:rPr>
-                <w:rFonts w:ascii="Arial" w:hAnsi="Arial" w:cs="Arial"/>
-                <w:sz w:val="16"/>
-                <w:szCs w:val="16"/>
-              </w:rPr>
-              <w:t>{{</w:t>
-            </w:r>
-            <w:r>
-              <w:rPr>
-                <w:rFonts w:ascii="Arial" w:hAnsi="Arial" w:cs="Arial"/>
-                <w:sz w:val="16"/>
-                <w:szCs w:val="16"/>
-              </w:rPr>
-              <w:t>Turno</w:t>
-            </w:r>
-            <w:r>
-              <w:rPr>
-                <w:rFonts w:ascii="Arial" w:hAnsi="Arial" w:cs="Arial"/>
-                <w:sz w:val="16"/>
-                <w:szCs w:val="16"/>
-              </w:rPr>
-              <w:t>}}</w:t>
-            </w:r>
-          </w:p>
-        </w:tc>
-        <w:tc>
-          <w:tcPr>
-            <w:tcW w:w="720" w:type="dxa"/>
-            <w:gridSpan w:val="2"/>
-            <w:tcBorders>
-              <w:top w:val="single" w:sz="8" w:space="0" w:color="auto"/>
-            </w:tcBorders>
-            <w:shd w:val="clear" w:color="auto" w:fill="auto"/>
-            <w:noWrap/>
-            <w:vAlign w:val="bottom"/>
-          </w:tcPr>
-          <w:p>
-            <w:pPr>
-              <w:rPr>
-                <w:rFonts w:ascii="Arial" w:hAnsi="Arial" w:cs="Arial"/>
-                <w:sz w:val="16"/>
-                <w:szCs w:val="16"/>
-              </w:rPr>
-            </w:pPr>
-            <w:r>
-              <w:rPr>
-                <w:rFonts w:ascii="Arial" w:hAnsi="Arial" w:cs="Arial"/>
-                <w:sz w:val="16"/>
-                <w:szCs w:val="16"/>
-              </w:rPr>
-              <w:t>Horario:</w:t>
-            </w:r>
-          </w:p>
-        </w:tc>
-        <w:tc>
-          <w:tcPr>
-            <w:tcW w:w="1800" w:type="dxa"/>
-            <w:gridSpan w:val="2"/>
-            <w:tcBorders>
-              <w:top w:val="single" w:sz="8" w:space="0" w:color="auto"/>
+              <w:t>Domicilio:</w:t>
+            </w:r>
+          </w:p>
+        </w:tc>
+        <w:tc>
+          <w:tcPr>
+            <w:tcW w:w="8194" w:type="dxa"/>
+            <w:gridSpan w:val="33"/>
+            <w:tcBorders>
+              <w:top w:val="nil"/>
               <w:bottom w:val="single" w:sz="8" w:space="0" w:color="auto"/>
               <w:right w:val="single" w:sz="18" w:space="0" w:color="auto"/>
             </w:tcBorders>
@@ -1357,345 +1752,35 @@
                 <w:rFonts w:ascii="Arial" w:hAnsi="Arial" w:cs="Arial"/>
                 <w:sz w:val="16"/>
                 <w:szCs w:val="16"/>
-              </w:rPr>
-            </w:pPr>
-            <w:r>
-              <w:rPr>
-                <w:rFonts w:ascii="Arial" w:hAnsi="Arial" w:cs="Arial"/>
-                <w:sz w:val="16"/>
-                <w:szCs w:val="16"/>
-              </w:rPr>
-              <w:t> </w:t>
-            </w:r>
-          </w:p>
-        </w:tc>
-      </w:tr>
-      <w:tr>
-        <w:trPr>
-          <w:trHeight w:val="126"/>
-        </w:trPr>
-        <w:tc>
-          <w:tcPr>
-            <w:tcW w:w="1130" w:type="dxa"/>
-            <w:gridSpan w:val="3"/>
-            <w:tcBorders>
-              <w:left w:val="single" w:sz="18" w:space="0" w:color="auto"/>
-            </w:tcBorders>
-            <w:shd w:val="clear" w:color="auto" w:fill="auto"/>
-            <w:noWrap/>
-            <w:vAlign w:val="bottom"/>
-          </w:tcPr>
-          <w:p>
-            <w:pPr>
-              <w:rPr>
-                <w:rFonts w:ascii="Arial" w:hAnsi="Arial" w:cs="Arial"/>
-                <w:sz w:val="16"/>
-                <w:szCs w:val="16"/>
-              </w:rPr>
-            </w:pPr>
-            <w:r>
-              <w:rPr>
-                <w:rFonts w:ascii="Arial" w:hAnsi="Arial" w:cs="Arial"/>
-                <w:sz w:val="16"/>
-                <w:szCs w:val="16"/>
-              </w:rPr>
-              <w:t>Clave del CT:</w:t>
-            </w:r>
-          </w:p>
-        </w:tc>
-        <w:tc>
-          <w:tcPr>
-            <w:tcW w:w="1460" w:type="dxa"/>
-            <w:gridSpan w:val="9"/>
-            <w:tcBorders>
-              <w:top w:val="nil"/>
-              <w:bottom w:val="single" w:sz="8" w:space="0" w:color="auto"/>
-            </w:tcBorders>
-            <w:shd w:val="clear" w:color="auto" w:fill="auto"/>
-            <w:noWrap/>
-            <w:vAlign w:val="bottom"/>
-          </w:tcPr>
-          <w:p>
-            <w:pPr>
-              <w:rPr>
-                <w:rFonts w:ascii="Arial" w:hAnsi="Arial" w:cs="Arial"/>
-                <w:sz w:val="16"/>
-                <w:szCs w:val="16"/>
-              </w:rPr>
-            </w:pPr>
-            <w:bookmarkStart w:id="0" w:name="CLAVE_CT"/>
-            <w:r>
-              <w:rPr>
-                <w:rFonts w:ascii="Arial" w:hAnsi="Arial" w:cs="Arial"/>
-                <w:sz w:val="16"/>
-                <w:szCs w:val="16"/>
+                <w:lang w:val="es-MX"/>
+              </w:rPr>
+            </w:pPr>
+            <w:r>
+              <w:rPr>
+                <w:rFonts w:ascii="Arial" w:hAnsi="Arial" w:cs="Arial"/>
+                <w:sz w:val="16"/>
+                <w:szCs w:val="16"/>
+                <w:lang w:val="es-MX"/>
               </w:rPr>
               <w:t>{{</w:t>
             </w:r>
-            <w:proofErr w:type="spellStart"/>
-            <w:r>
-              <w:rPr>
-                <w:rFonts w:ascii="Arial" w:hAnsi="Arial" w:cs="Arial"/>
-                <w:sz w:val="16"/>
-                <w:szCs w:val="16"/>
-              </w:rPr>
-              <w:t>Clave_CT</w:t>
-            </w:r>
-            <w:proofErr w:type="spellEnd"/>
-            <w:r>
-              <w:rPr>
-                <w:rFonts w:ascii="Arial" w:hAnsi="Arial" w:cs="Arial"/>
-                <w:sz w:val="16"/>
-                <w:szCs w:val="16"/>
+            <w:r>
+              <w:rPr>
+                <w:rFonts w:ascii="Arial" w:hAnsi="Arial" w:cs="Arial"/>
+                <w:sz w:val="16"/>
+                <w:szCs w:val="16"/>
+                <w:lang w:val="es-MX"/>
+              </w:rPr>
+              <w:t>Domicilio_CT</w:t>
+            </w:r>
+            <w:r>
+              <w:rPr>
+                <w:rFonts w:ascii="Arial" w:hAnsi="Arial" w:cs="Arial"/>
+                <w:sz w:val="16"/>
+                <w:szCs w:val="16"/>
+                <w:lang w:val="es-MX"/>
               </w:rPr>
               <w:t>}}</w:t>
-            </w:r>
-            <w:r>
-              <w:rPr>
-                <w:rFonts w:ascii="Arial" w:hAnsi="Arial" w:cs="Arial"/>
-                <w:sz w:val="16"/>
-                <w:szCs w:val="16"/>
-              </w:rPr>
-              <w:fldChar w:fldCharType="begin"/>
-            </w:r>
-            <w:r>
-              <w:rPr>
-                <w:rFonts w:ascii="Arial" w:hAnsi="Arial" w:cs="Arial"/>
-                <w:sz w:val="16"/>
-                <w:szCs w:val="16"/>
-              </w:rPr>
-              <w:instrText xml:space="preserve"> FILLIN  "CLAVE DEL CENTRO DE TRABAJO :"  \* MERGEFORMAT </w:instrText>
-            </w:r>
-            <w:r>
-              <w:rPr>
-                <w:rFonts w:ascii="Arial" w:hAnsi="Arial" w:cs="Arial"/>
-                <w:sz w:val="16"/>
-                <w:szCs w:val="16"/>
-              </w:rPr>
-              <w:fldChar w:fldCharType="end"/>
-            </w:r>
-            <w:bookmarkEnd w:id="0"/>
-          </w:p>
-        </w:tc>
-        <w:tc>
-          <w:tcPr>
-            <w:tcW w:w="1440" w:type="dxa"/>
-            <w:gridSpan w:val="5"/>
-            <w:shd w:val="clear" w:color="auto" w:fill="auto"/>
-            <w:noWrap/>
-            <w:vAlign w:val="bottom"/>
-          </w:tcPr>
-          <w:p>
-            <w:pPr>
-              <w:rPr>
-                <w:rFonts w:ascii="Arial" w:hAnsi="Arial" w:cs="Arial"/>
-                <w:sz w:val="16"/>
-                <w:szCs w:val="16"/>
-              </w:rPr>
-            </w:pPr>
-            <w:r>
-              <w:rPr>
-                <w:rFonts w:ascii="Arial" w:hAnsi="Arial" w:cs="Arial"/>
-                <w:sz w:val="16"/>
-                <w:szCs w:val="16"/>
-              </w:rPr>
-              <w:t>Zona económica:</w:t>
-            </w:r>
-          </w:p>
-        </w:tc>
-        <w:tc>
-          <w:tcPr>
-            <w:tcW w:w="900" w:type="dxa"/>
-            <w:gridSpan w:val="4"/>
-            <w:tcBorders>
-              <w:top w:val="nil"/>
-              <w:bottom w:val="single" w:sz="8" w:space="0" w:color="auto"/>
-            </w:tcBorders>
-            <w:shd w:val="clear" w:color="auto" w:fill="auto"/>
-            <w:noWrap/>
-            <w:vAlign w:val="bottom"/>
-          </w:tcPr>
-          <w:p>
-            <w:pPr>
-              <w:rPr>
-                <w:rFonts w:ascii="Arial" w:hAnsi="Arial" w:cs="Arial"/>
-                <w:sz w:val="16"/>
-                <w:szCs w:val="16"/>
-              </w:rPr>
-            </w:pPr>
-            <w:r>
-              <w:rPr>
-                <w:rFonts w:ascii="Arial" w:hAnsi="Arial" w:cs="Arial"/>
-                <w:sz w:val="16"/>
-                <w:szCs w:val="16"/>
-              </w:rPr>
-              <w:t xml:space="preserve"> </w:t>
-            </w:r>
-            <w:r>
-              <w:rPr>
-                <w:rFonts w:ascii="Arial" w:hAnsi="Arial" w:cs="Arial"/>
-                <w:sz w:val="16"/>
-                <w:szCs w:val="16"/>
-              </w:rPr>
-              <w:t>{{</w:t>
-            </w:r>
-            <w:proofErr w:type="spellStart"/>
-            <w:r>
-              <w:rPr>
-                <w:rFonts w:ascii="Arial" w:hAnsi="Arial" w:cs="Arial"/>
-                <w:sz w:val="16"/>
-                <w:szCs w:val="16"/>
-              </w:rPr>
-              <w:t>Z_economica</w:t>
-            </w:r>
-            <w:proofErr w:type="spellEnd"/>
-            <w:r>
-              <w:rPr>
-                <w:rFonts w:ascii="Arial" w:hAnsi="Arial" w:cs="Arial"/>
-                <w:sz w:val="16"/>
-                <w:szCs w:val="16"/>
-              </w:rPr>
-              <w:t>}}</w:t>
-            </w:r>
-          </w:p>
-        </w:tc>
-        <w:tc>
-          <w:tcPr>
-            <w:tcW w:w="1260" w:type="dxa"/>
-            <w:gridSpan w:val="8"/>
-            <w:shd w:val="clear" w:color="auto" w:fill="auto"/>
-            <w:noWrap/>
-            <w:vAlign w:val="bottom"/>
-          </w:tcPr>
-          <w:p>
-            <w:pPr>
-              <w:rPr>
-                <w:rFonts w:ascii="Arial" w:hAnsi="Arial" w:cs="Arial"/>
-                <w:sz w:val="16"/>
-                <w:szCs w:val="16"/>
-              </w:rPr>
-            </w:pPr>
-            <w:r>
-              <w:rPr>
-                <w:rFonts w:ascii="Arial" w:hAnsi="Arial" w:cs="Arial"/>
-                <w:sz w:val="16"/>
-                <w:szCs w:val="16"/>
-              </w:rPr>
-              <w:t>Zona escolar:</w:t>
-            </w:r>
-          </w:p>
-        </w:tc>
-        <w:tc>
-          <w:tcPr>
-            <w:tcW w:w="1080" w:type="dxa"/>
-            <w:gridSpan w:val="3"/>
-            <w:tcBorders>
-              <w:top w:val="nil"/>
-              <w:bottom w:val="single" w:sz="8" w:space="0" w:color="auto"/>
-            </w:tcBorders>
-            <w:shd w:val="clear" w:color="auto" w:fill="auto"/>
-            <w:noWrap/>
-            <w:vAlign w:val="bottom"/>
-          </w:tcPr>
-          <w:p>
-            <w:pPr>
-              <w:rPr>
-                <w:rFonts w:ascii="Arial" w:hAnsi="Arial" w:cs="Arial"/>
-                <w:sz w:val="16"/>
-                <w:szCs w:val="16"/>
-              </w:rPr>
-            </w:pPr>
-            <w:bookmarkStart w:id="1" w:name="Z_ESC"/>
-            <w:r>
-              <w:rPr>
-                <w:rFonts w:ascii="Arial" w:hAnsi="Arial" w:cs="Arial"/>
-                <w:sz w:val="16"/>
-                <w:szCs w:val="16"/>
-              </w:rPr>
-              <w:t xml:space="preserve">  </w:t>
-            </w:r>
-            <w:bookmarkEnd w:id="1"/>
-            <w:r>
-              <w:rPr>
-                <w:rFonts w:ascii="Arial" w:hAnsi="Arial" w:cs="Arial"/>
-                <w:sz w:val="16"/>
-                <w:szCs w:val="16"/>
-              </w:rPr>
-              <w:t>{{</w:t>
-            </w:r>
-            <w:proofErr w:type="spellStart"/>
-            <w:r>
-              <w:rPr>
-                <w:rFonts w:ascii="Arial" w:hAnsi="Arial" w:cs="Arial"/>
-                <w:sz w:val="16"/>
-                <w:szCs w:val="16"/>
-              </w:rPr>
-              <w:t>Z_Escolar</w:t>
-            </w:r>
-            <w:proofErr w:type="spellEnd"/>
-            <w:r>
-              <w:rPr>
-                <w:rFonts w:ascii="Arial" w:hAnsi="Arial" w:cs="Arial"/>
-                <w:sz w:val="16"/>
-                <w:szCs w:val="16"/>
-              </w:rPr>
-              <w:t>}}</w:t>
-            </w:r>
-          </w:p>
-        </w:tc>
-        <w:tc>
-          <w:tcPr>
-            <w:tcW w:w="720" w:type="dxa"/>
-            <w:gridSpan w:val="2"/>
-            <w:shd w:val="clear" w:color="auto" w:fill="auto"/>
-            <w:noWrap/>
-            <w:vAlign w:val="bottom"/>
-          </w:tcPr>
-          <w:p>
-            <w:pPr>
-              <w:rPr>
-                <w:rFonts w:ascii="Arial" w:hAnsi="Arial" w:cs="Arial"/>
-                <w:sz w:val="16"/>
-                <w:szCs w:val="16"/>
-              </w:rPr>
-            </w:pPr>
-            <w:r>
-              <w:rPr>
-                <w:rFonts w:ascii="Arial" w:hAnsi="Arial" w:cs="Arial"/>
-                <w:sz w:val="16"/>
-                <w:szCs w:val="16"/>
-              </w:rPr>
-              <w:t>Sector:</w:t>
-            </w:r>
-          </w:p>
-        </w:tc>
-        <w:tc>
-          <w:tcPr>
-            <w:tcW w:w="1171" w:type="dxa"/>
-            <w:tcBorders>
-              <w:top w:val="nil"/>
-              <w:bottom w:val="single" w:sz="8" w:space="0" w:color="auto"/>
-              <w:right w:val="single" w:sz="18" w:space="0" w:color="auto"/>
-            </w:tcBorders>
-            <w:shd w:val="clear" w:color="auto" w:fill="auto"/>
-            <w:noWrap/>
-            <w:vAlign w:val="bottom"/>
-          </w:tcPr>
-          <w:p>
-            <w:pPr>
-              <w:rPr>
-                <w:rFonts w:ascii="Arial" w:hAnsi="Arial" w:cs="Arial"/>
-                <w:sz w:val="16"/>
-                <w:szCs w:val="16"/>
-              </w:rPr>
-            </w:pPr>
-            <w:r>
-              <w:rPr>
-                <w:rFonts w:ascii="Arial" w:hAnsi="Arial" w:cs="Arial"/>
-                <w:sz w:val="20"/>
-                <w:szCs w:val="20"/>
-              </w:rPr>
-              <w:t> </w:t>
             </w:r>
           </w:p>
         </w:tc>
@@ -1729,14 +1814,94 @@
                 <w:sz w:val="16"/>
                 <w:szCs w:val="16"/>
               </w:rPr>
-              <w:t>Domicilio:</w:t>
-            </w:r>
-          </w:p>
-        </w:tc>
-        <w:tc>
-          <w:tcPr>
-            <w:tcW w:w="8194" w:type="dxa"/>
-            <w:gridSpan w:val="33"/>
+              <w:t>Población:</w:t>
+            </w:r>
+          </w:p>
+        </w:tc>
+        <w:tc>
+          <w:tcPr>
+            <w:tcW w:w="3565" w:type="dxa"/>
+            <w:gridSpan w:val="18"/>
+            <w:tcBorders>
+              <w:top w:val="nil"/>
+              <w:bottom w:val="single" w:sz="8" w:space="0" w:color="auto"/>
+            </w:tcBorders>
+            <w:shd w:val="clear" w:color="auto" w:fill="auto"/>
+            <w:noWrap/>
+            <w:vAlign w:val="bottom"/>
+          </w:tcPr>
+          <w:p>
+            <w:pPr>
+              <w:rPr>
+                <w:rFonts w:ascii="Arial" w:hAnsi="Arial" w:cs="Arial"/>
+                <w:sz w:val="16"/>
+                <w:szCs w:val="16"/>
+              </w:rPr>
+            </w:pPr>
+            <w:r>
+              <w:rPr>
+                <w:rFonts w:ascii="Arial" w:hAnsi="Arial" w:cs="Arial"/>
+                <w:sz w:val="16"/>
+                <w:szCs w:val="16"/>
+              </w:rPr>
+              <w:t>{{</w:t>
+            </w:r>
+            <w:r>
+              <w:rPr>
+                <w:rFonts w:ascii="Arial" w:hAnsi="Arial" w:cs="Arial"/>
+                <w:sz w:val="16"/>
+                <w:szCs w:val="16"/>
+              </w:rPr>
+              <w:t>Poblacion</w:t>
+            </w:r>
+            <w:r>
+              <w:rPr>
+                <w:rFonts w:ascii="Arial" w:hAnsi="Arial" w:cs="Arial"/>
+                <w:sz w:val="16"/>
+                <w:szCs w:val="16"/>
+              </w:rPr>
+              <w:t>}}</w:t>
+            </w:r>
+            <w:r>
+              <w:rPr>
+                <w:rFonts w:ascii="Arial" w:hAnsi="Arial" w:cs="Arial"/>
+                <w:sz w:val="16"/>
+                <w:szCs w:val="16"/>
+              </w:rPr>
+              <w:t>, DGO.</w:t>
+            </w:r>
+          </w:p>
+        </w:tc>
+        <w:tc>
+          <w:tcPr>
+            <w:tcW w:w="935" w:type="dxa"/>
+            <w:gridSpan w:val="5"/>
+            <w:shd w:val="clear" w:color="auto" w:fill="auto"/>
+            <w:noWrap/>
+            <w:vAlign w:val="bottom"/>
+          </w:tcPr>
+          <w:p>
+            <w:pPr>
+              <w:rPr>
+                <w:rFonts w:ascii="Arial" w:hAnsi="Arial" w:cs="Arial"/>
+                <w:sz w:val="16"/>
+                <w:szCs w:val="16"/>
+              </w:rPr>
+            </w:pPr>
+            <w:r>
+              <w:rPr>
+                <w:rFonts w:ascii="Arial" w:hAnsi="Arial" w:cs="Arial"/>
+                <w:sz w:val="16"/>
+                <w:szCs w:val="16"/>
+              </w:rPr>
+              <w:t>Pagaduría:</w:t>
+            </w:r>
+          </w:p>
+        </w:tc>
+        <w:tc>
+          <w:tcPr>
+            <w:tcW w:w="3694" w:type="dxa"/>
+            <w:gridSpan w:val="10"/>
             <w:tcBorders>
               <w:top w:val="nil"/>
               <w:bottom w:val="single" w:sz="8" w:space="0" w:color="auto"/>
@@ -1752,37 +1917,15 @@
                 <w:rFonts w:ascii="Arial" w:hAnsi="Arial" w:cs="Arial"/>
                 <w:sz w:val="16"/>
                 <w:szCs w:val="16"/>
-                <w:lang w:val="es-MX"/>
-              </w:rPr>
-            </w:pPr>
-            <w:r>
-              <w:rPr>
-                <w:rFonts w:ascii="Arial" w:hAnsi="Arial" w:cs="Arial"/>
-                <w:sz w:val="16"/>
-                <w:szCs w:val="16"/>
-                <w:lang w:val="es-MX"/>
-              </w:rPr>
-              <w:t>{{</w:t>
-            </w:r>
-            <w:proofErr w:type="spellStart"/>
-            <w:r>
-              <w:rPr>
-                <w:rFonts w:ascii="Arial" w:hAnsi="Arial" w:cs="Arial"/>
-                <w:sz w:val="16"/>
-                <w:szCs w:val="16"/>
-                <w:lang w:val="es-MX"/>
-              </w:rPr>
-              <w:t>Domicilio_CT</w:t>
-            </w:r>
-            <w:proofErr w:type="spellEnd"/>
-            <w:r>
-              <w:rPr>
-                <w:rFonts w:ascii="Arial" w:hAnsi="Arial" w:cs="Arial"/>
-                <w:sz w:val="16"/>
-                <w:szCs w:val="16"/>
-                <w:lang w:val="es-MX"/>
-              </w:rPr>
-              <w:t>}}</w:t>
+              </w:rPr>
+            </w:pPr>
+            <w:r>
+              <w:rPr>
+                <w:rFonts w:ascii="Arial" w:hAnsi="Arial" w:cs="Arial"/>
+                <w:sz w:val="16"/>
+                <w:szCs w:val="16"/>
+              </w:rPr>
+              <w:t xml:space="preserve"> </w:t>
             </w:r>
           </w:p>
         </w:tc>
@@ -1793,153 +1936,6 @@
         </w:trPr>
         <w:tc>
           <w:tcPr>
-            <w:tcW w:w="967" w:type="dxa"/>
-            <w:gridSpan w:val="2"/>
-            <w:tcBorders>
-              <w:left w:val="single" w:sz="18" w:space="0" w:color="auto"/>
-            </w:tcBorders>
-            <w:shd w:val="clear" w:color="auto" w:fill="auto"/>
-            <w:noWrap/>
-            <w:vAlign w:val="bottom"/>
-          </w:tcPr>
-          <w:p>
-            <w:pPr>
-              <w:rPr>
-                <w:rFonts w:ascii="Arial" w:hAnsi="Arial" w:cs="Arial"/>
-                <w:sz w:val="16"/>
-                <w:szCs w:val="16"/>
-              </w:rPr>
-            </w:pPr>
-            <w:r>
-              <w:rPr>
-                <w:rFonts w:ascii="Arial" w:hAnsi="Arial" w:cs="Arial"/>
-                <w:sz w:val="16"/>
-                <w:szCs w:val="16"/>
-              </w:rPr>
-              <w:t>Población:</w:t>
-            </w:r>
-          </w:p>
-        </w:tc>
-        <w:tc>
-          <w:tcPr>
-            <w:tcW w:w="3565" w:type="dxa"/>
-            <w:gridSpan w:val="18"/>
-            <w:tcBorders>
-              <w:top w:val="nil"/>
-              <w:bottom w:val="single" w:sz="8" w:space="0" w:color="auto"/>
-            </w:tcBorders>
-            <w:shd w:val="clear" w:color="auto" w:fill="auto"/>
-            <w:noWrap/>
-            <w:vAlign w:val="bottom"/>
-          </w:tcPr>
-          <w:p>
-            <w:pPr>
-              <w:rPr>
-                <w:rFonts w:ascii="Arial" w:hAnsi="Arial" w:cs="Arial"/>
-                <w:sz w:val="16"/>
-                <w:szCs w:val="16"/>
-              </w:rPr>
-            </w:pPr>
-            <w:r>
-              <w:rPr>
-                <w:rFonts w:ascii="Arial" w:hAnsi="Arial" w:cs="Arial"/>
-                <w:sz w:val="16"/>
-                <w:szCs w:val="16"/>
-              </w:rPr>
-              <w:t>{{</w:t>
-            </w:r>
-            <w:proofErr w:type="spellStart"/>
-            <w:r>
-              <w:rPr>
-                <w:rFonts w:ascii="Arial" w:hAnsi="Arial" w:cs="Arial"/>
-                <w:sz w:val="16"/>
-                <w:szCs w:val="16"/>
-              </w:rPr>
-              <w:t>Poblacion</w:t>
-            </w:r>
-            <w:proofErr w:type="spellEnd"/>
-            <w:r>
-              <w:rPr>
-                <w:rFonts w:ascii="Arial" w:hAnsi="Arial" w:cs="Arial"/>
-                <w:sz w:val="16"/>
-                <w:szCs w:val="16"/>
-              </w:rPr>
-              <w:t>}}</w:t>
-            </w:r>
-            <w:r>
-              <w:rPr>
-                <w:rFonts w:ascii="Arial" w:hAnsi="Arial" w:cs="Arial"/>
-                <w:sz w:val="16"/>
-                <w:szCs w:val="16"/>
-              </w:rPr>
-              <w:t>, DGO.</w:t>
-            </w:r>
-          </w:p>
-        </w:tc>
-        <w:tc>
-          <w:tcPr>
-            <w:tcW w:w="935" w:type="dxa"/>
-            <w:gridSpan w:val="5"/>
-            <w:shd w:val="clear" w:color="auto" w:fill="auto"/>
-            <w:noWrap/>
-            <w:vAlign w:val="bottom"/>
-          </w:tcPr>
-          <w:p>
-            <w:pPr>
-              <w:rPr>
-                <w:rFonts w:ascii="Arial" w:hAnsi="Arial" w:cs="Arial"/>
-                <w:sz w:val="16"/>
-                <w:szCs w:val="16"/>
-              </w:rPr>
-            </w:pPr>
-            <w:r>
-              <w:rPr>
-                <w:rFonts w:ascii="Arial" w:hAnsi="Arial" w:cs="Arial"/>
-                <w:sz w:val="16"/>
-                <w:szCs w:val="16"/>
-              </w:rPr>
-              <w:t>Pagaduría:</w:t>
-            </w:r>
-          </w:p>
-        </w:tc>
-        <w:tc>
-          <w:tcPr>
-            <w:tcW w:w="3694" w:type="dxa"/>
-            <w:gridSpan w:val="10"/>
-            <w:tcBorders>
-              <w:top w:val="nil"/>
-              <w:bottom w:val="single" w:sz="8" w:space="0" w:color="auto"/>
-              <w:right w:val="single" w:sz="18" w:space="0" w:color="auto"/>
-            </w:tcBorders>
-            <w:shd w:val="clear" w:color="auto" w:fill="auto"/>
-            <w:noWrap/>
-            <w:vAlign w:val="bottom"/>
-          </w:tcPr>
-          <w:p>
-            <w:pPr>
-              <w:rPr>
-                <w:rFonts w:ascii="Arial" w:hAnsi="Arial" w:cs="Arial"/>
-                <w:sz w:val="16"/>
-                <w:szCs w:val="16"/>
-              </w:rPr>
-            </w:pPr>
-            <w:r>
-              <w:rPr>
-                <w:rFonts w:ascii="Arial" w:hAnsi="Arial" w:cs="Arial"/>
-                <w:sz w:val="16"/>
-                <w:szCs w:val="16"/>
-              </w:rPr>
-              <w:t xml:space="preserve"> </w:t>
-            </w:r>
-          </w:p>
-        </w:tc>
-      </w:tr>
-      <w:tr>
-        <w:trPr>
-          <w:trHeight w:val="256"/>
-        </w:trPr>
-        <w:tc>
-          <w:tcPr>
             <w:tcW w:w="1686" w:type="dxa"/>
             <w:gridSpan w:val="7"/>
             <w:tcBorders>
@@ -1995,7 +1991,6 @@
               </w:rPr>
               <w:t>{{</w:t>
             </w:r>
-            <w:proofErr w:type="spellStart"/>
             <w:r>
               <w:rPr>
                 <w:rFonts w:ascii="Arial" w:hAnsi="Arial" w:cs="Arial"/>
@@ -2004,7 +1999,6 @@
               </w:rPr>
               <w:t>T_Movimiento</w:t>
             </w:r>
-            <w:proofErr w:type="spellEnd"/>
             <w:r>
               <w:rPr>
                 <w:rFonts w:ascii="Arial" w:hAnsi="Arial" w:cs="Arial"/>
@@ -2512,7 +2506,7 @@
         </w:rPr>
         <w:t>OBSERVAC</w:t>
       </w:r>
-      <w:bookmarkStart w:id="2" w:name="_Hlk111711805"/>
+      <w:bookmarkStart w:id="3" w:name="_Hlk111711805"/>
       <w:r>
         <w:rPr>
           <w:rFonts w:ascii="Arial" w:hAnsi="Arial" w:cs="Arial"/>
@@ -2567,7 +2561,6 @@
         </w:rPr>
         <w:t>{{</w:t>
       </w:r>
-      <w:proofErr w:type="spellStart"/>
       <w:r>
         <w:rPr>
           <w:rFonts w:ascii="Arial" w:hAnsi="Arial" w:cs="Arial"/>
@@ -2577,7 +2570,6 @@
         </w:rPr>
         <w:t>No_Prel</w:t>
       </w:r>
-      <w:proofErr w:type="spellEnd"/>
       <w:r>
         <w:rPr>
           <w:rFonts w:ascii="Arial" w:hAnsi="Arial" w:cs="Arial"/>
@@ -2605,7 +2597,7 @@
         </w:rPr>
         <w:t xml:space="preserve">Y </w:t>
       </w:r>
-      <w:bookmarkStart w:id="3" w:name="folio2"/>
+      <w:bookmarkStart w:id="4" w:name="folio2"/>
       <w:r>
         <w:rPr>
           <w:rFonts w:ascii="Arial" w:hAnsi="Arial" w:cs="Arial"/>
@@ -2651,7 +2643,6 @@
         </w:rPr>
         <w:t>{{</w:t>
       </w:r>
-      <w:proofErr w:type="spellStart"/>
       <w:r>
         <w:rPr>
           <w:rFonts w:ascii="Arial" w:hAnsi="Arial" w:cs="Arial"/>
@@ -2661,7 +2652,6 @@
         </w:rPr>
         <w:t>Folio_Prel</w:t>
       </w:r>
-      <w:proofErr w:type="spellEnd"/>
       <w:r>
         <w:rPr>
           <w:rFonts w:ascii="Arial" w:hAnsi="Arial" w:cs="Arial"/>
@@ -2698,7 +2688,7 @@
         </w:rPr>
         <w:fldChar w:fldCharType="end"/>
       </w:r>
-      <w:bookmarkEnd w:id="3"/>
+      <w:bookmarkEnd w:id="4"/>
       <w:r>
         <w:rPr>
           <w:rFonts w:ascii="Calibri" w:hAnsi="Calibri" w:cs="Calibri"/>
@@ -2717,7 +2707,6 @@
         </w:rPr>
         <w:t>{{</w:t>
       </w:r>
-      <w:proofErr w:type="spellStart"/>
       <w:r>
         <w:rPr>
           <w:rFonts w:ascii="Calibri" w:hAnsi="Calibri" w:cs="Calibri"/>
@@ -2727,7 +2716,6 @@
         </w:rPr>
         <w:t>Tipo_Val</w:t>
       </w:r>
-      <w:proofErr w:type="spellEnd"/>
       <w:r>
         <w:rPr>
           <w:rFonts w:ascii="Calibri" w:hAnsi="Calibri" w:cs="Calibri"/>
@@ -2869,40 +2857,22 @@
           <w:sz w:val="20"/>
           <w:szCs w:val="20"/>
         </w:rPr>
-        <w:t xml:space="preserve">Victoria de Durango, </w:t>
+        <w:t xml:space="preserve">Victoria de Durango, Dgo., a </w:t>
       </w:r>
-      <w:proofErr w:type="spellStart"/>
       <w:r>
         <w:rPr>
           <w:sz w:val="20"/>
           <w:szCs w:val="20"/>
         </w:rPr>
-        <w:t>Dgo</w:t>
+        <w:t>{{</w:t>
       </w:r>
-      <w:proofErr w:type="spellEnd"/>
       <w:r>
         <w:rPr>
           <w:sz w:val="20"/>
           <w:szCs w:val="20"/>
         </w:rPr>
-        <w:t xml:space="preserve">., a </w:t>
-      </w:r>
-      <w:r>
-        <w:rPr>
-          <w:sz w:val="20"/>
-          <w:szCs w:val="20"/>
-        </w:rPr>
-        <w:t>{{</w:t>
-      </w:r>
-      <w:proofErr w:type="spellStart"/>
-      <w:r>
-        <w:rPr>
-          <w:sz w:val="20"/>
-          <w:szCs w:val="20"/>
-        </w:rPr>
         <w:t>F_Hoy</w:t>
       </w:r>
-      <w:proofErr w:type="spellEnd"/>
       <w:r>
         <w:rPr>
           <w:sz w:val="20"/>
@@ -2984,7 +2954,7 @@
         </w:rPr>
         <w:t xml:space="preserve"> DEPARTAMENTO DE EDUCACION </w:t>
       </w:r>
-      <w:bookmarkEnd w:id="2"/>
+      <w:bookmarkEnd w:id="3"/>
       <w:r>
         <w:rPr>
           <w:b/>
@@ -3004,23 +2974,13 @@
           <w:szCs w:val="16"/>
         </w:rPr>
       </w:pPr>
-      <w:proofErr w:type="spellStart"/>
       <w:r>
         <w:rPr>
           <w:rFonts w:ascii="Arial" w:hAnsi="Arial" w:cs="Arial"/>
           <w:sz w:val="16"/>
           <w:szCs w:val="16"/>
         </w:rPr>
-        <w:t>Vo</w:t>
-      </w:r>
-      <w:proofErr w:type="spellEnd"/>
-      <w:r>
-        <w:rPr>
-          <w:rFonts w:ascii="Arial" w:hAnsi="Arial" w:cs="Arial"/>
-          <w:sz w:val="16"/>
-          <w:szCs w:val="16"/>
-        </w:rPr>
-        <w:t>. Bo. del Nivel Educativo</w:t>
+        <w:t>Vo. Bo. del Nivel Educativo</w:t>
       </w:r>
     </w:p>
     <w:p>
@@ -9827,7 +9787,7 @@
                     </wp:anchor>
                   </w:drawing>
                 </mc:Choice>
-                <mc:Fallback xmlns:w16sdtdh="http://schemas.microsoft.com/office/word/2020/wordml/sdtdatahash" xmlns:w16du="http://schemas.microsoft.com/office/word/2023/wordml/word16du" xmlns:w16="http://schemas.microsoft.com/office/word/2018/wordml" xmlns:w16cid="http://schemas.microsoft.com/office/word/2016/wordml/cid" xmlns:w16cex="http://schemas.microsoft.com/office/word/2018/wordml/cex" xmlns:oel="http://schemas.microsoft.com/office/2019/extlst" xmlns:am3d="http://schemas.microsoft.com/office/drawing/2017/model3d" xmlns:aink="http://schemas.microsoft.com/office/drawing/2016/ink" xmlns:cx8="http://schemas.microsoft.com/office/drawing/2016/5/14/chartex" xmlns:cx7="http://schemas.microsoft.com/office/drawing/2016/5/13/chartex" xmlns:cx6="http://schemas.microsoft.com/office/drawing/2016/5/12/chartex" xmlns:cx5="http://schemas.microsoft.com/office/drawing/2016/5/11/chartex" xmlns:cx4="http://schemas.microsoft.com/office/drawing/2016/5/10/chartex" xmlns:cx3="http://schemas.microsoft.com/office/drawing/2016/5/9/chartex" xmlns:cx2="http://schemas.microsoft.com/office/drawing/2015/10/21/chartex" xmlns:cx1="http://schemas.microsoft.com/office/drawing/2015/9/8/chartex">
+                <mc:Fallback xmlns:cx1="http://schemas.microsoft.com/office/drawing/2015/9/8/chartex" xmlns:cx2="http://schemas.microsoft.com/office/drawing/2015/10/21/chartex" xmlns:cx3="http://schemas.microsoft.com/office/drawing/2016/5/9/chartex" xmlns:cx4="http://schemas.microsoft.com/office/drawing/2016/5/10/chartex" xmlns:cx5="http://schemas.microsoft.com/office/drawing/2016/5/11/chartex" xmlns:cx6="http://schemas.microsoft.com/office/drawing/2016/5/12/chartex" xmlns:cx7="http://schemas.microsoft.com/office/drawing/2016/5/13/chartex" xmlns:cx8="http://schemas.microsoft.com/office/drawing/2016/5/14/chartex" xmlns:aink="http://schemas.microsoft.com/office/drawing/2016/ink" xmlns:am3d="http://schemas.microsoft.com/office/drawing/2017/model3d" xmlns:oel="http://schemas.microsoft.com/office/2019/extlst" xmlns:w16cex="http://schemas.microsoft.com/office/word/2018/wordml/cex" xmlns:w16cid="http://schemas.microsoft.com/office/word/2016/wordml/cid" xmlns:w16="http://schemas.microsoft.com/office/word/2018/wordml" xmlns:w16du="http://schemas.microsoft.com/office/word/2023/wordml/word16du" xmlns:w16sdtdh="http://schemas.microsoft.com/office/word/2020/wordml/sdtdatahash">
                   <w:pict>
                     <v:line w14:anchorId="1DE5A985" id="Conector recto 11" o:spid="_x0000_s1026" style="position:absolute;z-index:251684864;visibility:visible;mso-wrap-style:square;mso-width-percent:0;mso-height-percent:0;mso-wrap-distance-left:9pt;mso-wrap-distance-top:0;mso-wrap-distance-right:9pt;mso-wrap-distance-bottom:0;mso-position-horizontal:absolute;mso-position-horizontal-relative:text;mso-position-vertical:absolute;mso-position-vertical-relative:text;mso-width-percent:0;mso-height-percent:0;mso-width-relative:margin;mso-height-relative:margin" from="38.1pt,-.15pt" to="212.1pt,-.15pt" o:gfxdata="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" strokecolor="black [3200]" strokeweight=".5pt">
                       <v:stroke joinstyle="miter"/>
@@ -10435,7 +10395,7 @@
                     </wp:anchor>
                   </w:drawing>
                 </mc:Choice>
-                <mc:Fallback xmlns:w16sdtdh="http://schemas.microsoft.com/office/word/2020/wordml/sdtdatahash" xmlns:w16du="http://schemas.microsoft.com/office/word/2023/wordml/word16du" xmlns:w16="http://schemas.microsoft.com/office/word/2018/wordml" xmlns:w16cid="http://schemas.microsoft.com/office/word/2016/wordml/cid" xmlns:w16cex="http://schemas.microsoft.com/office/word/2018/wordml/cex" xmlns:oel="http://schemas.microsoft.com/office/2019/extlst" xmlns:am3d="http://schemas.microsoft.com/office/drawing/2017/model3d" xmlns:aink="http://schemas.microsoft.com/office/drawing/2016/ink" xmlns:cx8="http://schemas.microsoft.com/office/drawing/2016/5/14/chartex" xmlns:cx7="http://schemas.microsoft.com/office/drawing/2016/5/13/chartex" xmlns:cx6="http://schemas.microsoft.com/office/drawing/2016/5/12/chartex" xmlns:cx5="http://schemas.microsoft.com/office/drawing/2016/5/11/chartex" xmlns:cx4="http://schemas.microsoft.com/office/drawing/2016/5/10/chartex" xmlns:cx3="http://schemas.microsoft.com/office/drawing/2016/5/9/chartex" xmlns:cx2="http://schemas.microsoft.com/office/drawing/2015/10/21/chartex" xmlns:cx1="http://schemas.microsoft.com/office/drawing/2015/9/8/chartex">
+                <mc:Fallback xmlns:cx1="http://schemas.microsoft.com/office/drawing/2015/9/8/chartex" xmlns:cx2="http://schemas.microsoft.com/office/drawing/2015/10/21/chartex" xmlns:cx3="http://schemas.microsoft.com/office/drawing/2016/5/9/chartex" xmlns:cx4="http://schemas.microsoft.com/office/drawing/2016/5/10/chartex" xmlns:cx5="http://schemas.microsoft.com/office/drawing/2016/5/11/chartex" xmlns:cx6="http://schemas.microsoft.com/office/drawing/2016/5/12/chartex" xmlns:cx7="http://schemas.microsoft.com/office/drawing/2016/5/13/chartex" xmlns:cx8="http://schemas.microsoft.com/office/drawing/2016/5/14/chartex" xmlns:aink="http://schemas.microsoft.com/office/drawing/2016/ink" xmlns:am3d="http://schemas.microsoft.com/office/drawing/2017/model3d" xmlns:oel="http://schemas.microsoft.com/office/2019/extlst" xmlns:w16cex="http://schemas.microsoft.com/office/word/2018/wordml/cex" xmlns:w16cid="http://schemas.microsoft.com/office/word/2016/wordml/cid" xmlns:w16="http://schemas.microsoft.com/office/word/2018/wordml" xmlns:w16du="http://schemas.microsoft.com/office/word/2023/wordml/word16du" xmlns:w16sdtdh="http://schemas.microsoft.com/office/word/2020/wordml/sdtdatahash">
                   <w:pict>
                     <v:line w14:anchorId="026C9BFB" id="Conector recto 7" o:spid="_x0000_s1026" style="position:absolute;z-index:251682816;visibility:visible;mso-wrap-style:square;mso-width-percent:0;mso-height-percent:0;mso-wrap-distance-left:9pt;mso-wrap-distance-top:0;mso-wrap-distance-right:9pt;mso-wrap-distance-bottom:0;mso-position-horizontal:absolute;mso-position-horizontal-relative:text;mso-position-vertical:absolute;mso-position-vertical-relative:text;mso-width-percent:0;mso-height-percent:0;mso-width-relative:margin;mso-height-relative:margin" from="39.1pt,-1.4pt" to="189.1pt,-1.4pt" o:gfxdata="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" strokecolor="black [3200]" strokeweight=".5pt">
                       <v:stroke joinstyle="miter"/>
@@ -11461,7 +11421,7 @@
                     </wp:anchor>
                   </w:drawing>
                 </mc:Choice>
-                <mc:Fallback xmlns:w16sdtdh="http://schemas.microsoft.com/office/word/2020/wordml/sdtdatahash" xmlns:w16du="http://schemas.microsoft.com/office/word/2023/wordml/word16du" xmlns:w16="http://schemas.microsoft.com/office/word/2018/wordml" xmlns:w16cid="http://schemas.microsoft.com/office/word/2016/wordml/cid" xmlns:w16cex="http://schemas.microsoft.com/office/word/2018/wordml/cex" xmlns:oel="http://schemas.microsoft.com/office/2019/extlst" xmlns:am3d="http://schemas.microsoft.com/office/drawing/2017/model3d" xmlns:aink="http://schemas.microsoft.com/office/drawing/2016/ink" xmlns:cx8="http://schemas.microsoft.com/office/drawing/2016/5/14/chartex" xmlns:cx7="http://schemas.microsoft.com/office/drawing/2016/5/13/chartex" xmlns:cx6="http://schemas.microsoft.com/office/drawing/2016/5/12/chartex" xmlns:cx5="http://schemas.microsoft.com/office/drawing/2016/5/11/chartex" xmlns:cx4="http://schemas.microsoft.com/office/drawing/2016/5/10/chartex" xmlns:cx3="http://schemas.microsoft.com/office/drawing/2016/5/9/chartex" xmlns:cx2="http://schemas.microsoft.com/office/drawing/2015/10/21/chartex" xmlns:cx1="http://schemas.microsoft.com/office/drawing/2015/9/8/chartex">
+                <mc:Fallback xmlns:cx1="http://schemas.microsoft.com/office/drawing/2015/9/8/chartex" xmlns:cx2="http://schemas.microsoft.com/office/drawing/2015/10/21/chartex" xmlns:cx3="http://schemas.microsoft.com/office/drawing/2016/5/9/chartex" xmlns:cx4="http://schemas.microsoft.com/office/drawing/2016/5/10/chartex" xmlns:cx5="http://schemas.microsoft.com/office/drawing/2016/5/11/chartex" xmlns:cx6="http://schemas.microsoft.com/office/drawing/2016/5/12/chartex" xmlns:cx7="http://schemas.microsoft.com/office/drawing/2016/5/13/chartex" xmlns:cx8="http://schemas.microsoft.com/office/drawing/2016/5/14/chartex" xmlns:aink="http://schemas.microsoft.com/office/drawing/2016/ink" xmlns:am3d="http://schemas.microsoft.com/office/drawing/2017/model3d" xmlns:oel="http://schemas.microsoft.com/office/2019/extlst" xmlns:w16cex="http://schemas.microsoft.com/office/word/2018/wordml/cex" xmlns:w16cid="http://schemas.microsoft.com/office/word/2016/wordml/cid" xmlns:w16="http://schemas.microsoft.com/office/word/2018/wordml" xmlns:w16du="http://schemas.microsoft.com/office/word/2023/wordml/word16du" xmlns:w16sdtdh="http://schemas.microsoft.com/office/word/2020/wordml/sdtdatahash">
                   <w:pict>
                     <v:line w14:anchorId="6A3487D4" id="Conector recto 5" o:spid="_x0000_s1026" style="position:absolute;flip:y;z-index:251681792;visibility:visible;mso-wrap-style:square;mso-width-percent:0;mso-height-percent:0;mso-wrap-distance-left:9pt;mso-wrap-distance-top:0;mso-wrap-distance-right:9pt;mso-wrap-distance-bottom:0;mso-position-horizontal:absolute;mso-position-horizontal-relative:text;mso-position-vertical:absolute;mso-position-vertical-relative:text;mso-width-percent:0;mso-height-percent:0;mso-width-relative:margin;mso-height-relative:margin" from="32.95pt,-.25pt" to="224.95pt,-.25pt" o:gfxdata="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" strokecolor="black [3213]" strokeweight=".5pt">
                       <v:stroke joinstyle="miter"/>
@@ -13561,7 +13521,6 @@
               </w:rPr>
               <w:t>{{</w:t>
             </w:r>
-            <w:proofErr w:type="spellStart"/>
             <w:r>
               <w:rPr>
                 <w:rFonts w:ascii="Arial" w:hAnsi="Arial" w:cs="Arial"/>
@@ -13571,7 +13530,6 @@
               </w:rPr>
               <w:t>No_Prel</w:t>
             </w:r>
-            <w:proofErr w:type="spellEnd"/>
             <w:r>
               <w:rPr>
                 <w:rFonts w:ascii="Arial" w:hAnsi="Arial" w:cs="Arial"/>
@@ -13625,7 +13583,6 @@
               </w:rPr>
               <w:t>{{</w:t>
             </w:r>
-            <w:proofErr w:type="spellStart"/>
             <w:r>
               <w:rPr>
                 <w:rFonts w:ascii="Arial" w:hAnsi="Arial" w:cs="Arial"/>
@@ -13635,7 +13592,6 @@
               </w:rPr>
               <w:t>Folio_Prel</w:t>
             </w:r>
-            <w:proofErr w:type="spellEnd"/>
             <w:r>
               <w:rPr>
                 <w:rFonts w:ascii="Arial" w:hAnsi="Arial" w:cs="Arial"/>
@@ -13674,7 +13630,6 @@
               </w:rPr>
               <w:t>{{</w:t>
             </w:r>
-            <w:proofErr w:type="spellStart"/>
             <w:r>
               <w:rPr>
                 <w:rFonts w:ascii="Arial" w:hAnsi="Arial" w:cs="Arial"/>
@@ -13684,7 +13639,6 @@
               </w:rPr>
               <w:t>Tipo_Val</w:t>
             </w:r>
-            <w:proofErr w:type="spellEnd"/>
             <w:r>
               <w:rPr>
                 <w:rFonts w:ascii="Arial" w:hAnsi="Arial" w:cs="Arial"/>
@@ -18352,7 +18306,7 @@
               </wp:anchor>
             </w:drawing>
           </mc:Choice>
-          <mc:Fallback xmlns:w16sdtdh="http://schemas.microsoft.com/office/word/2020/wordml/sdtdatahash" xmlns:w16du="http://schemas.microsoft.com/office/word/2023/wordml/word16du" xmlns:w16="http://schemas.microsoft.com/office/word/2018/wordml" xmlns:w16cid="http://schemas.microsoft.com/office/word/2016/wordml/cid" xmlns:w16cex="http://schemas.microsoft.com/office/word/2018/wordml/cex" xmlns:oel="http://schemas.microsoft.com/office/2019/extlst" xmlns:am3d="http://schemas.microsoft.com/office/drawing/2017/model3d" xmlns:aink="http://schemas.microsoft.com/office/drawing/2016/ink" xmlns:cx8="http://schemas.microsoft.com/office/drawing/2016/5/14/chartex" xmlns:cx7="http://schemas.microsoft.com/office/drawing/2016/5/13/chartex" xmlns:cx6="http://schemas.microsoft.com/office/drawing/2016/5/12/chartex" xmlns:cx5="http://schemas.microsoft.com/office/drawing/2016/5/11/chartex" xmlns:cx4="http://schemas.microsoft.com/office/drawing/2016/5/10/chartex" xmlns:cx3="http://schemas.microsoft.com/office/drawing/2016/5/9/chartex" xmlns:cx2="http://schemas.microsoft.com/office/drawing/2015/10/21/chartex" xmlns:cx1="http://schemas.microsoft.com/office/drawing/2015/9/8/chartex">
+          <mc:Fallback xmlns:cx1="http://schemas.microsoft.com/office/drawing/2015/9/8/chartex" xmlns:cx2="http://schemas.microsoft.com/office/drawing/2015/10/21/chartex" xmlns:cx3="http://schemas.microsoft.com/office/drawing/2016/5/9/chartex" xmlns:cx4="http://schemas.microsoft.com/office/drawing/2016/5/10/chartex" xmlns:cx5="http://schemas.microsoft.com/office/drawing/2016/5/11/chartex" xmlns:cx6="http://schemas.microsoft.com/office/drawing/2016/5/12/chartex" xmlns:cx7="http://schemas.microsoft.com/office/drawing/2016/5/13/chartex" xmlns:cx8="http://schemas.microsoft.com/office/drawing/2016/5/14/chartex" xmlns:aink="http://schemas.microsoft.com/office/drawing/2016/ink" xmlns:am3d="http://schemas.microsoft.com/office/drawing/2017/model3d" xmlns:oel="http://schemas.microsoft.com/office/2019/extlst" xmlns:w16cex="http://schemas.microsoft.com/office/word/2018/wordml/cex" xmlns:w16cid="http://schemas.microsoft.com/office/word/2016/wordml/cid" xmlns:w16="http://schemas.microsoft.com/office/word/2018/wordml" xmlns:w16du="http://schemas.microsoft.com/office/word/2023/wordml/word16du" xmlns:w16sdtdh="http://schemas.microsoft.com/office/word/2020/wordml/sdtdatahash">
             <w:pict>
               <v:line w14:anchorId="735A7923" id="Conector recto 66" o:spid="_x0000_s1026" style="position:absolute;flip:y;z-index:251675648;visibility:visible;mso-wrap-style:square;mso-width-percent:0;mso-height-percent:0;mso-wrap-distance-left:9pt;mso-wrap-distance-top:0;mso-wrap-distance-right:9pt;mso-wrap-distance-bottom:0;mso-position-horizontal:absolute;mso-position-horizontal-relative:text;mso-position-vertical:absolute;mso-position-vertical-relative:text;mso-width-percent:0;mso-height-percent:0;mso-width-relative:margin;mso-height-relative:margin" from="-2.65pt,32.25pt" to="260.6pt,32.25pt" o:gfxdata="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" strokecolor="black [3200]" strokeweight=".5pt">
                 <v:stroke joinstyle="miter"/>
@@ -18474,7 +18428,7 @@
               </wp:anchor>
             </w:drawing>
           </mc:Choice>
-          <mc:Fallback xmlns:w16sdtdh="http://schemas.microsoft.com/office/word/2020/wordml/sdtdatahash" xmlns:w16du="http://schemas.microsoft.com/office/word/2023/wordml/word16du" xmlns:w16="http://schemas.microsoft.com/office/word/2018/wordml" xmlns:w16cid="http://schemas.microsoft.com/office/word/2016/wordml/cid" xmlns:w16cex="http://schemas.microsoft.com/office/word/2018/wordml/cex" xmlns:oel="http://schemas.microsoft.com/office/2019/extlst" xmlns:am3d="http://schemas.microsoft.com/office/drawing/2017/model3d" xmlns:aink="http://schemas.microsoft.com/office/drawing/2016/ink" xmlns:cx8="http://schemas.microsoft.com/office/drawing/2016/5/14/chartex" xmlns:cx7="http://schemas.microsoft.com/office/drawing/2016/5/13/chartex" xmlns:cx6="http://schemas.microsoft.com/office/drawing/2016/5/12/chartex" xmlns:cx5="http://schemas.microsoft.com/office/drawing/2016/5/11/chartex" xmlns:cx4="http://schemas.microsoft.com/office/drawing/2016/5/10/chartex" xmlns:cx3="http://schemas.microsoft.com/office/drawing/2016/5/9/chartex" xmlns:cx2="http://schemas.microsoft.com/office/drawing/2015/10/21/chartex" xmlns:cx1="http://schemas.microsoft.com/office/drawing/2015/9/8/chartex">
+          <mc:Fallback xmlns:cx1="http://schemas.microsoft.com/office/drawing/2015/9/8/chartex" xmlns:cx2="http://schemas.microsoft.com/office/drawing/2015/10/21/chartex" xmlns:cx3="http://schemas.microsoft.com/office/drawing/2016/5/9/chartex" xmlns:cx4="http://schemas.microsoft.com/office/drawing/2016/5/10/chartex" xmlns:cx5="http://schemas.microsoft.com/office/drawing/2016/5/11/chartex" xmlns:cx6="http://schemas.microsoft.com/office/drawing/2016/5/12/chartex" xmlns:cx7="http://schemas.microsoft.com/office/drawing/2016/5/13/chartex" xmlns:cx8="http://schemas.microsoft.com/office/drawing/2016/5/14/chartex" xmlns:aink="http://schemas.microsoft.com/office/drawing/2016/ink" xmlns:am3d="http://schemas.microsoft.com/office/drawing/2017/model3d" xmlns:oel="http://schemas.microsoft.com/office/2019/extlst" xmlns:w16cex="http://schemas.microsoft.com/office/word/2018/wordml/cex" xmlns:w16cid="http://schemas.microsoft.com/office/word/2016/wordml/cid" xmlns:w16="http://schemas.microsoft.com/office/word/2018/wordml" xmlns:w16du="http://schemas.microsoft.com/office/word/2023/wordml/word16du" xmlns:w16sdtdh="http://schemas.microsoft.com/office/word/2020/wordml/sdtdatahash">
             <w:pict>
               <v:line w14:anchorId="50565A40" id="Conector recto 67" o:spid="_x0000_s1026" style="position:absolute;z-index:251677696;visibility:visible;mso-wrap-style:square;mso-width-percent:0;mso-height-percent:0;mso-wrap-distance-left:9pt;mso-wrap-distance-top:0;mso-wrap-distance-right:9pt;mso-wrap-distance-bottom:0;mso-position-horizontal:absolute;mso-position-horizontal-relative:text;mso-position-vertical:absolute;mso-position-vertical-relative:text;mso-width-percent:0;mso-height-percent:0;mso-width-relative:margin;mso-height-relative:margin" from="446.6pt,11.55pt" to="660.35pt,12.3pt" o:gfxdata="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" strokecolor="black [3200]" strokeweight=".5pt">
                 <v:stroke joinstyle="miter"/>
@@ -18687,8 +18641,8 @@
         </w:rPr>
         <w:t>OFICIO DEE</w:t>
       </w:r>
-      <w:bookmarkStart w:id="4" w:name="FOLIO"/>
-      <w:bookmarkEnd w:id="4"/>
+      <w:bookmarkStart w:id="5" w:name="FOLIO"/>
+      <w:bookmarkEnd w:id="5"/>
       <w:r>
         <w:rPr>
           <w:rFonts w:ascii="Arial" w:hAnsi="Arial" w:cs="Arial"/>
@@ -18707,7 +18661,6 @@
         </w:rPr>
         <w:t>{{</w:t>
       </w:r>
-      <w:proofErr w:type="spellStart"/>
       <w:r>
         <w:rPr>
           <w:rFonts w:ascii="Arial" w:hAnsi="Arial" w:cs="Arial"/>
@@ -18717,7 +18670,6 @@
         </w:rPr>
         <w:t>F_OfPres</w:t>
       </w:r>
-      <w:proofErr w:type="spellEnd"/>
       <w:r>
         <w:rPr>
           <w:rFonts w:ascii="Arial" w:hAnsi="Arial" w:cs="Arial"/>
@@ -18761,7 +18713,7 @@
           <w:sz w:val="20"/>
           <w:szCs w:val="20"/>
         </w:rPr>
-        <w:t>/2025</w:t>
+        <w:t>/2026</w:t>
       </w:r>
     </w:p>
     <w:p>
@@ -19041,8 +18993,6 @@
         </w:rPr>
         <w:t>}}</w:t>
       </w:r>
-      <w:bookmarkStart w:id="5" w:name="_GoBack"/>
-      <w:bookmarkEnd w:id="5"/>
     </w:p>
     <w:p>
       <w:pPr>
@@ -19736,7 +19686,6 @@
         </w:rPr>
         <w:t>{{</w:t>
       </w:r>
-      <w:proofErr w:type="spellStart"/>
       <w:r>
         <w:rPr>
           <w:rFonts w:ascii="Arial" w:hAnsi="Arial" w:cs="Arial"/>
@@ -19745,7 +19694,6 @@
         </w:rPr>
         <w:t>T_Movimiento</w:t>
       </w:r>
-      <w:proofErr w:type="spellEnd"/>
       <w:r>
         <w:rPr>
           <w:rFonts w:ascii="Arial" w:hAnsi="Arial" w:cs="Arial"/>
@@ -21487,7 +21435,7 @@
               </wp:anchor>
             </w:drawing>
           </mc:Choice>
-          <mc:Fallback xmlns:w16sdtdh="http://schemas.microsoft.com/office/word/2020/wordml/sdtdatahash" xmlns:w16du="http://schemas.microsoft.com/office/word/2023/wordml/word16du" xmlns:w16="http://schemas.microsoft.com/office/word/2018/wordml" xmlns:w16cid="http://schemas.microsoft.com/office/word/2016/wordml/cid" xmlns:w16cex="http://schemas.microsoft.com/office/word/2018/wordml/cex" xmlns:oel="http://schemas.microsoft.com/office/2019/extlst" xmlns:am3d="http://schemas.microsoft.com/office/drawing/2017/model3d" xmlns:aink="http://schemas.microsoft.com/office/drawing/2016/ink" xmlns:cx8="http://schemas.microsoft.com/office/drawing/2016/5/14/chartex" xmlns:cx7="http://schemas.microsoft.com/office/drawing/2016/5/13/chartex" xmlns:cx6="http://schemas.microsoft.com/office/drawing/2016/5/12/chartex" xmlns:cx5="http://schemas.microsoft.com/office/drawing/2016/5/11/chartex" xmlns:cx4="http://schemas.microsoft.com/office/drawing/2016/5/10/chartex" xmlns:cx3="http://schemas.microsoft.com/office/drawing/2016/5/9/chartex" xmlns:cx2="http://schemas.microsoft.com/office/drawing/2015/10/21/chartex" xmlns:cx1="http://schemas.microsoft.com/office/drawing/2015/9/8/chartex">
+          <mc:Fallback xmlns:cx1="http://schemas.microsoft.com/office/drawing/2015/9/8/chartex" xmlns:cx2="http://schemas.microsoft.com/office/drawing/2015/10/21/chartex" xmlns:cx3="http://schemas.microsoft.com/office/drawing/2016/5/9/chartex" xmlns:cx4="http://schemas.microsoft.com/office/drawing/2016/5/10/chartex" xmlns:cx5="http://schemas.microsoft.com/office/drawing/2016/5/11/chartex" xmlns:cx6="http://schemas.microsoft.com/office/drawing/2016/5/12/chartex" xmlns:cx7="http://schemas.microsoft.com/office/drawing/2016/5/13/chartex" xmlns:cx8="http://schemas.microsoft.com/office/drawing/2016/5/14/chartex" xmlns:aink="http://schemas.microsoft.com/office/drawing/2016/ink" xmlns:am3d="http://schemas.microsoft.com/office/drawing/2017/model3d" xmlns:oel="http://schemas.microsoft.com/office/2019/extlst" xmlns:w16cex="http://schemas.microsoft.com/office/word/2018/wordml/cex" xmlns:w16cid="http://schemas.microsoft.com/office/word/2016/wordml/cid" xmlns:w16="http://schemas.microsoft.com/office/word/2018/wordml" xmlns:w16du="http://schemas.microsoft.com/office/word/2023/wordml/word16du" xmlns:w16sdtdh="http://schemas.microsoft.com/office/word/2020/wordml/sdtdatahash">
             <w:pict>
               <v:line w14:anchorId="3DB20B95" id="Conector recto 9" o:spid="_x0000_s1026" style="position:absolute;flip:y;z-index:251678720;visibility:visible;mso-wrap-style:square;mso-wrap-distance-left:9pt;mso-wrap-distance-top:0;mso-wrap-distance-right:9pt;mso-wrap-distance-bottom:0;mso-position-horizontal:absolute;mso-position-horizontal-relative:text;mso-position-vertical:absolute;mso-position-vertical-relative:text" from="504.35pt,11.2pt" to="618.35pt,11.95pt" o:gfxdata="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" strokecolor="black [3200]" strokeweight=".5pt">
                 <v:stroke joinstyle="miter"/>
@@ -21617,13 +21565,7 @@
           <w:sz w:val="20"/>
           <w:szCs w:val="20"/>
         </w:rPr>
-        <w:t xml:space="preserve">       FIRMA DE RESPONSABLE </w:t>
-      </w:r>
-      <w:r>
-        <w:rPr>
-          <w:rFonts w:ascii="Tahoma" w:hAnsi="Tahoma" w:cs="Tahoma"/>
-        </w:rPr>
-        <w:t xml:space="preserve">                 </w:t>
+        <w:t>JEFA DEL DEPARTAMENTO DE EDUCACIÓN ESPECIAL.</w:t>
       </w:r>
     </w:p>
     <w:p>
@@ -22079,7 +22021,7 @@
               <v:shape id="_x0000_i1025" type="#_x0000_t75" style="width:82.5pt;height:56.25pt">
                 <v:imagedata r:id="rId1" o:title=""/>
               </v:shape>
-              <o:OLEObject Type="Embed" ProgID="PBrush" ShapeID="_x0000_i1025" DrawAspect="Content" ObjectID="_1829798867" r:id="rId2"/>
+              <o:OLEObject Type="Embed" ProgID="PBrush" ShapeID="_x0000_i1025" DrawAspect="Content" ObjectID="_1850373280" r:id="rId2"/>
             </w:object>
           </w:r>
         </w:p>
@@ -22799,7 +22741,7 @@
         <w:noProof/>
         <w:sz w:val="16"/>
         <w:szCs w:val="16"/>
-        <w:lang w:val="en-US"/>
+        <w:lang w:val="en-US" w:eastAsia="en-US"/>
       </w:rPr>
       <w:drawing>
         <wp:anchor distT="0" distB="0" distL="114300" distR="114300" simplePos="0" relativeHeight="251666432" behindDoc="1" locked="0" layoutInCell="1" allowOverlap="1" wp14:anchorId="062607C5" wp14:editId="2FB4CAF4">
@@ -22900,7 +22842,7 @@
         <v:shape id="_x0000_s2050" type="#_x0000_t75" style="position:absolute;margin-left:-10.15pt;margin-top:-19.7pt;width:89.25pt;height:63.75pt;z-index:251664384;mso-wrap-style:tight">
           <v:imagedata r:id="rId1" o:title=""/>
         </v:shape>
-        <o:OLEObject Type="Embed" ProgID="PBrush" ShapeID="_x0000_s2050" DrawAspect="Content" ObjectID="_1829798868" r:id="rId2"/>
+        <o:OLEObject Type="Embed" ProgID="PBrush" ShapeID="_x0000_s2050" DrawAspect="Content" ObjectID="_1850373281" r:id="rId2"/>
       </w:object>
     </w:r>
   </w:p>
@@ -24286,7 +24228,7 @@
 </file>
 
 <file path=customXml/itemProps1.xml><?xml version="1.0" encoding="utf-8"?>
-<ds:datastoreItem xmlns:ds="http://schemas.openxmlformats.org/officeDocument/2006/customXml" ds:itemID="{36F71BE9-524E-4FD4-9F02-0008AAC0AFDC}">
+<ds:datastoreItem xmlns:ds="http://schemas.openxmlformats.org/officeDocument/2006/customXml" ds:itemID="{A8B9FD80-8E09-42B3-AFB7-C73ED3ACCD80}">
   <ds:schemaRefs>
     <ds:schemaRef ds:uri="http://schemas.openxmlformats.org/officeDocument/2006/bibliography"/>
   </ds:schemaRefs>

</xml_diff>